<commit_message>
Eltereforum EN: reviewer changes (Y. Ewertz, K. Zilm) + standard intro/outro
</commit_message>
<xml_diff>
--- a/Biergerpakt_Podcast_Scripts_All_Episodes_EN_2026-09-30.docx
+++ b/Biergerpakt_Podcast_Scripts_All_Episodes_EN_2026-09-30.docx
@@ -2203,47 +2203,47 @@
         <w:rPr>
           <w:rtl w:val="0"/>
         </w:rPr>
-        <w:t xml:space="preserve"> Exactly. The official description is very warm. The parent forums are welcoming places for discussion, information and support — for all parents.</w:t>
-      </w:r>
-    </w:p>
-    <w:p>
-      <w:pPr>
-        <w:spacing w:after="120" w:lineRule="auto"/>
-        <w:rPr/>
-      </w:pPr>
-      <w:r>
-        <w:rPr>
-          <w:b w:val="1"/>
-          <w:bCs w:val="1"/>
-          <w:rtl w:val="0"/>
-        </w:rPr>
-        <w:t xml:space="preserve">ANNA:</w:t>
-      </w:r>
-      <w:r>
-        <w:rPr>
-          <w:rtl w:val="0"/>
-        </w:rPr>
-        <w:t xml:space="preserve"> For all parents. So not only for parents with problems?</w:t>
-      </w:r>
-    </w:p>
-    <w:p>
-      <w:pPr>
-        <w:spacing w:after="120" w:lineRule="auto"/>
-        <w:rPr/>
-      </w:pPr>
-      <w:r>
-        <w:rPr>
-          <w:b w:val="1"/>
-          <w:bCs w:val="1"/>
-          <w:rtl w:val="0"/>
-        </w:rPr>
-        <w:t xml:space="preserve">TOM:</w:t>
-      </w:r>
-      <w:r>
-        <w:rPr>
-          <w:rtl w:val="0"/>
-        </w:rPr>
-        <w:t xml:space="preserve"> No, no — and this is important. It's for everyone. The Eltereforum is generalist. It's a normal, friendly place where any parent can come, ask questions, learn something, and meet other parents. You don't need a special reason. You don't need to have a problem.</w:t>
+        <w:t xml:space="preserve"> Exactly. The official description is very inviting. The parent forums are welcoming places for discussion, information and support — for all parents.</w:t>
+      </w:r>
+    </w:p>
+    <w:p>
+      <w:pPr>
+        <w:spacing w:after="120" w:lineRule="auto"/>
+        <w:rPr/>
+      </w:pPr>
+      <w:r>
+        <w:rPr>
+          <w:b w:val="1"/>
+          <w:bCs w:val="1"/>
+          <w:rtl w:val="0"/>
+        </w:rPr>
+        <w:t xml:space="preserve">ANNA:</w:t>
+      </w:r>
+      <w:r>
+        <w:rPr>
+          <w:rtl w:val="0"/>
+        </w:rPr>
+        <w:t xml:space="preserve"> For all parents. So not only for parents facing difficulties?</w:t>
+      </w:r>
+    </w:p>
+    <w:p>
+      <w:pPr>
+        <w:spacing w:after="120" w:lineRule="auto"/>
+        <w:rPr/>
+      </w:pPr>
+      <w:r>
+        <w:rPr>
+          <w:b w:val="1"/>
+          <w:bCs w:val="1"/>
+          <w:rtl w:val="0"/>
+        </w:rPr>
+        <w:t xml:space="preserve">TOM:</w:t>
+      </w:r>
+      <w:r>
+        <w:rPr>
+          <w:rtl w:val="0"/>
+        </w:rPr>
+        <w:t xml:space="preserve"> No, no — and this is important. It's for everyone. The Eltereforum is open to all. It's a normal, friendly place where any parent can come, ask questions, learn something, and meet other parents. You don't need a special reason. You don't need to have a specific issue.</w:t>
       </w:r>
     </w:p>
     <w:p>
@@ -2443,27 +2443,27 @@
         <w:rPr>
           <w:rtl w:val="0"/>
         </w:rPr>
-        <w:t xml:space="preserve"> Lots of things. Let me list the main ones. There are parent meetings — so, moments to get together and exchange with other parents. There are parenting classes — like little courses on raising children. There are activities for parents together with their children. And there are themed evenings, talks and lectures — for example, an evening about sleep, or about digital tools, or about reading.</w:t>
-      </w:r>
-    </w:p>
-    <w:p>
-      <w:pPr>
-        <w:spacing w:after="120" w:lineRule="auto"/>
-        <w:rPr/>
-      </w:pPr>
-      <w:r>
-        <w:rPr>
-          <w:b w:val="1"/>
-          <w:bCs w:val="1"/>
-          <w:rtl w:val="0"/>
-        </w:rPr>
-        <w:t xml:space="preserve">ANNA:</w:t>
-      </w:r>
-      <w:r>
-        <w:rPr>
-          <w:rtl w:val="0"/>
-        </w:rPr>
-        <w:t xml:space="preserve"> So courses, evenings, meetings, and parent-child activities.</w:t>
+        <w:t xml:space="preserve"> Lots of things. Let me list the main ones. There are parent meetings — so, moments to get together and exchange with other parents. There are also courses that offer specific guidance on different aspects of parenting. There are activities for parents together with their children. And there are themed evenings, talks and lectures — for example, an evening about sleep, or about digital tools, or about reading.</w:t>
+      </w:r>
+    </w:p>
+    <w:p>
+      <w:pPr>
+        <w:spacing w:after="120" w:lineRule="auto"/>
+        <w:rPr/>
+      </w:pPr>
+      <w:r>
+        <w:rPr>
+          <w:b w:val="1"/>
+          <w:bCs w:val="1"/>
+          <w:rtl w:val="0"/>
+        </w:rPr>
+        <w:t xml:space="preserve">ANNA:</w:t>
+      </w:r>
+      <w:r>
+        <w:rPr>
+          <w:rtl w:val="0"/>
+        </w:rPr>
+        <w:t xml:space="preserve"> So courses, evenings, meetings, and activities for parents and their kids.</w:t>
       </w:r>
     </w:p>
     <w:p>
@@ -2563,27 +2563,27 @@
         <w:rPr>
           <w:rtl w:val="0"/>
         </w:rPr>
-        <w:t xml:space="preserve"> That's an important point. The Eltereforum is generalist — it does not give specialised treatment. It's not a clinic or a therapy centre. But if you need something more specific, the team listens to you and guides you. They point you to the right specialised service. So it's also a door — a first place to go, that sends you in the right direction.</w:t>
-      </w:r>
-    </w:p>
-    <w:p>
-      <w:pPr>
-        <w:spacing w:after="120" w:lineRule="auto"/>
-        <w:rPr/>
-      </w:pPr>
-      <w:r>
-        <w:rPr>
-          <w:b w:val="1"/>
-          <w:bCs w:val="1"/>
-          <w:rtl w:val="0"/>
-        </w:rPr>
-        <w:t xml:space="preserve">ANNA:</w:t>
-      </w:r>
-      <w:r>
-        <w:rPr>
-          <w:rtl w:val="0"/>
-        </w:rPr>
-        <w:t xml:space="preserve"> So even if they can't solve everything, they help me find who can.</w:t>
+        <w:t xml:space="preserve"> That's an important point. The Eltereforum is like a general practitioner — it does not give specialised treatment. It's not a clinic or a therapy centre. But if you need something more specific, the team listens to you and guides you. They point you to the right specialised service. So it's also a door — a first place to go, that sends you in the right direction.</w:t>
+      </w:r>
+    </w:p>
+    <w:p>
+      <w:pPr>
+        <w:spacing w:after="120" w:lineRule="auto"/>
+        <w:rPr/>
+      </w:pPr>
+      <w:r>
+        <w:rPr>
+          <w:b w:val="1"/>
+          <w:bCs w:val="1"/>
+          <w:rtl w:val="0"/>
+        </w:rPr>
+        <w:t xml:space="preserve">ANNA:</w:t>
+      </w:r>
+      <w:r>
+        <w:rPr>
+          <w:rtl w:val="0"/>
+        </w:rPr>
+        <w:t xml:space="preserve"> So even if they can't help me with a specific issue, they are connected well enough to find someone who can.</w:t>
       </w:r>
     </w:p>
     <w:p>

</xml_diff>

<commit_message>
All episodes EN/FR/DE/LB: standard greeting, revised intro/outro and farewell (MyGuichet wording)
</commit_message>
<xml_diff>
--- a/Biergerpakt_Podcast_Scripts_All_Episodes_EN_2026-09-30.docx
+++ b/Biergerpakt_Podcast_Scripts_All_Episodes_EN_2026-09-30.docx
@@ -13200,7 +13200,7 @@
         <w:rPr>
           <w:rtl w:val="0"/>
         </w:rPr>
-        <w:t xml:space="preserve">. Thank you so much for listening.</w:t>
+        <w:t xml:space="preserve">.</w:t>
       </w:r>
     </w:p>
     <w:p>
@@ -13227,46 +13227,38 @@
       </w:r>
       <w:r>
         <w:rPr>
+          <w:rtl w:val="0"/>
+        </w:rPr>
+        <w:t xml:space="preserve"> Thank you, everyone. Take care... and see you next time!</w:t>
+      </w:r>
+    </w:p>
+    <w:p>
+      <w:pPr>
+        <w:spacing w:after="120" w:lineRule="auto"/>
+        <w:rPr>
           <w:i w:val="1"/>
           <w:iCs w:val="1"/>
           <w:sz w:val="16"/>
           <w:szCs w:val="16"/>
-          <w:rtl w:val="0"/>
-        </w:rPr>
-        <w:t xml:space="preserve"> Thank you, everyone. Take care... and see you next time!</w:t>
-      </w:r>
-    </w:p>
-    <w:p>
-      <w:pPr>
-        <w:spacing w:after="120" w:lineRule="auto"/>
-        <w:rPr>
+        </w:rPr>
+      </w:pPr>
+      <w:r>
+        <w:rPr>
+          <w:b w:val="1"/>
+          <w:bCs w:val="1"/>
           <w:i w:val="1"/>
           <w:iCs w:val="1"/>
           <w:sz w:val="16"/>
           <w:szCs w:val="16"/>
-        </w:rPr>
-      </w:pPr>
-      <w:r>
-        <w:rPr>
-          <w:b w:val="1"/>
-          <w:bCs w:val="1"/>
-          <w:i w:val="1"/>
-          <w:iCs w:val="1"/>
-          <w:sz w:val="16"/>
-          <w:szCs w:val="16"/>
-          <w:rtl w:val="0"/>
-        </w:rPr>
-        <w:t xml:space="preserve">ANNA:</w:t>
-      </w:r>
-      <w:r>
-        <w:rPr>
-          <w:i w:val="1"/>
-          <w:iCs w:val="1"/>
-          <w:sz w:val="16"/>
-          <w:szCs w:val="16"/>
-          <w:rtl w:val="0"/>
-        </w:rPr>
-        <w:t xml:space="preserve"> Bye bye!</w:t>
+          <w:rtl w:val="0"/>
+        </w:rPr>
+        <w:t xml:space="preserve">ANNA:</w:t>
+      </w:r>
+      <w:r>
+        <w:rPr>
+          <w:rtl w:val="0"/>
+        </w:rPr>
+        <w:t xml:space="preserve"> Thank you so much for listening.</w:t>
       </w:r>
     </w:p>
     <w:p>
@@ -15205,7 +15197,7 @@
         <w:rPr>
           <w:rtl w:val="0"/>
         </w:rPr>
-        <w:t xml:space="preserve">. Thank you so much for listening.</w:t>
+        <w:t xml:space="preserve">.</w:t>
       </w:r>
     </w:p>
     <w:p>
@@ -15245,7 +15237,7 @@
         <w:rPr>
           <w:rtl w:val="0"/>
         </w:rPr>
-        <w:t xml:space="preserve"> Bye bye!</w:t>
+        <w:t xml:space="preserve"> Thank you so much for listening.</w:t>
       </w:r>
     </w:p>
     <w:p>
@@ -19305,7 +19297,7 @@
         <w:rPr>
           <w:rtl w:val="0"/>
         </w:rPr>
-        <w:t xml:space="preserve">. Thank you so much for listening.</w:t>
+        <w:t xml:space="preserve">.</w:t>
       </w:r>
     </w:p>
     <w:p>
@@ -19345,7 +19337,7 @@
         <w:rPr>
           <w:rtl w:val="0"/>
         </w:rPr>
-        <w:t xml:space="preserve"> Bye bye!</w:t>
+        <w:t xml:space="preserve"> Thank you so much for listening.</w:t>
       </w:r>
     </w:p>
     <w:p>
@@ -21781,7 +21773,7 @@
         <w:rPr>
           <w:rtl w:val="0"/>
         </w:rPr>
-        <w:t xml:space="preserve"> Hello, and welcome back! It's a pleasure to have you with us today.</w:t>
+        <w:t xml:space="preserve"> Hello, and welcome! It's really nice to have you with us today.</w:t>
       </w:r>
     </w:p>
     <w:p>
@@ -23517,47 +23509,47 @@
         <w:rPr>
           <w:rtl w:val="0"/>
         </w:rPr>
-        <w:t xml:space="preserve">. Thank you so much for listening today.</w:t>
-      </w:r>
-    </w:p>
-    <w:p>
-      <w:pPr>
-        <w:spacing w:after="120" w:lineRule="auto"/>
-        <w:rPr/>
-      </w:pPr>
-      <w:r>
-        <w:rPr>
-          <w:b w:val="1"/>
-          <w:bCs w:val="1"/>
-          <w:rtl w:val="0"/>
-        </w:rPr>
-        <w:t xml:space="preserve">TOM:</w:t>
-      </w:r>
-      <w:r>
-        <w:rPr>
-          <w:rtl w:val="0"/>
-        </w:rPr>
-        <w:t xml:space="preserve"> Take care, and see you in the next episode. Äddi!</w:t>
-      </w:r>
-    </w:p>
-    <w:p>
-      <w:pPr>
-        <w:spacing w:after="120" w:lineRule="auto"/>
-        <w:rPr/>
-      </w:pPr>
-      <w:r>
-        <w:rPr>
-          <w:b w:val="1"/>
-          <w:bCs w:val="1"/>
-          <w:rtl w:val="0"/>
-        </w:rPr>
-        <w:t xml:space="preserve">ANNA:</w:t>
-      </w:r>
-      <w:r>
-        <w:rPr>
-          <w:rtl w:val="0"/>
-        </w:rPr>
-        <w:t xml:space="preserve"> Äddi!</w:t>
+        <w:t xml:space="preserve">.</w:t>
+      </w:r>
+    </w:p>
+    <w:p>
+      <w:pPr>
+        <w:spacing w:after="120" w:lineRule="auto"/>
+        <w:rPr/>
+      </w:pPr>
+      <w:r>
+        <w:rPr>
+          <w:b w:val="1"/>
+          <w:bCs w:val="1"/>
+          <w:rtl w:val="0"/>
+        </w:rPr>
+        <w:t xml:space="preserve">TOM:</w:t>
+      </w:r>
+      <w:r>
+        <w:rPr>
+          <w:rtl w:val="0"/>
+        </w:rPr>
+        <w:t xml:space="preserve"> Thank you, everyone. Take care... and see you next time!</w:t>
+      </w:r>
+    </w:p>
+    <w:p>
+      <w:pPr>
+        <w:spacing w:after="120" w:lineRule="auto"/>
+        <w:rPr/>
+      </w:pPr>
+      <w:r>
+        <w:rPr>
+          <w:b w:val="1"/>
+          <w:bCs w:val="1"/>
+          <w:rtl w:val="0"/>
+        </w:rPr>
+        <w:t xml:space="preserve">ANNA:</w:t>
+      </w:r>
+      <w:r>
+        <w:rPr>
+          <w:rtl w:val="0"/>
+        </w:rPr>
+        <w:t xml:space="preserve"> Thank you so much for listening.</w:t>
       </w:r>
     </w:p>
     <w:p>
@@ -23642,7 +23634,7 @@
         <w:rPr>
           <w:rtl w:val="0"/>
         </w:rPr>
-        <w:t xml:space="preserve"> Hello, and welcome back! It's wonderful to have you with us today.</w:t>
+        <w:t xml:space="preserve"> Hello, and welcome! It's really nice to have you with us today.</w:t>
       </w:r>
     </w:p>
     <w:p>
@@ -25298,47 +25290,47 @@
         <w:rPr>
           <w:rtl w:val="0"/>
         </w:rPr>
-        <w:t xml:space="preserve">. Thank you so much for listening today.</w:t>
-      </w:r>
-    </w:p>
-    <w:p>
-      <w:pPr>
-        <w:spacing w:after="120" w:lineRule="auto"/>
-        <w:rPr/>
-      </w:pPr>
-      <w:r>
-        <w:rPr>
-          <w:b w:val="1"/>
-          <w:bCs w:val="1"/>
-          <w:rtl w:val="0"/>
-        </w:rPr>
-        <w:t xml:space="preserve">TOM:</w:t>
-      </w:r>
-      <w:r>
-        <w:rPr>
-          <w:rtl w:val="0"/>
-        </w:rPr>
-        <w:t xml:space="preserve"> Take care, and see you in the next episode. Äddi!</w:t>
-      </w:r>
-    </w:p>
-    <w:p>
-      <w:pPr>
-        <w:spacing w:after="120" w:lineRule="auto"/>
-        <w:rPr/>
-      </w:pPr>
-      <w:r>
-        <w:rPr>
-          <w:b w:val="1"/>
-          <w:bCs w:val="1"/>
-          <w:rtl w:val="0"/>
-        </w:rPr>
-        <w:t xml:space="preserve">ANNA:</w:t>
-      </w:r>
-      <w:r>
-        <w:rPr>
-          <w:rtl w:val="0"/>
-        </w:rPr>
-        <w:t xml:space="preserve"> Äddi!</w:t>
+        <w:t xml:space="preserve">.</w:t>
+      </w:r>
+    </w:p>
+    <w:p>
+      <w:pPr>
+        <w:spacing w:after="120" w:lineRule="auto"/>
+        <w:rPr/>
+      </w:pPr>
+      <w:r>
+        <w:rPr>
+          <w:b w:val="1"/>
+          <w:bCs w:val="1"/>
+          <w:rtl w:val="0"/>
+        </w:rPr>
+        <w:t xml:space="preserve">TOM:</w:t>
+      </w:r>
+      <w:r>
+        <w:rPr>
+          <w:rtl w:val="0"/>
+        </w:rPr>
+        <w:t xml:space="preserve"> Thank you, everyone. Take care... and see you next time!</w:t>
+      </w:r>
+    </w:p>
+    <w:p>
+      <w:pPr>
+        <w:spacing w:after="120" w:lineRule="auto"/>
+        <w:rPr/>
+      </w:pPr>
+      <w:r>
+        <w:rPr>
+          <w:b w:val="1"/>
+          <w:bCs w:val="1"/>
+          <w:rtl w:val="0"/>
+        </w:rPr>
+        <w:t xml:space="preserve">ANNA:</w:t>
+      </w:r>
+      <w:r>
+        <w:rPr>
+          <w:rtl w:val="0"/>
+        </w:rPr>
+        <w:t xml:space="preserve"> Thank you so much for listening.</w:t>
       </w:r>
     </w:p>
     <w:p>
@@ -25423,7 +25415,7 @@
         <w:rPr>
           <w:rtl w:val="0"/>
         </w:rPr>
-        <w:t xml:space="preserve"> Hello, and welcome back! It's lovely to have you with us today.</w:t>
+        <w:t xml:space="preserve"> Hello, and welcome! It's really nice to have you with us today.</w:t>
       </w:r>
     </w:p>
     <w:p>
@@ -26919,47 +26911,47 @@
         <w:rPr>
           <w:rtl w:val="0"/>
         </w:rPr>
-        <w:t xml:space="preserve">. Thank you so much for listening today.</w:t>
-      </w:r>
-    </w:p>
-    <w:p>
-      <w:pPr>
-        <w:spacing w:after="120" w:lineRule="auto"/>
-        <w:rPr/>
-      </w:pPr>
-      <w:r>
-        <w:rPr>
-          <w:b w:val="1"/>
-          <w:bCs w:val="1"/>
-          <w:rtl w:val="0"/>
-        </w:rPr>
-        <w:t xml:space="preserve">TOM:</w:t>
-      </w:r>
-      <w:r>
-        <w:rPr>
-          <w:rtl w:val="0"/>
-        </w:rPr>
-        <w:t xml:space="preserve"> Take care, and see you in the next episode. Äddi!</w:t>
-      </w:r>
-    </w:p>
-    <w:p>
-      <w:pPr>
-        <w:spacing w:after="120" w:lineRule="auto"/>
-        <w:rPr/>
-      </w:pPr>
-      <w:r>
-        <w:rPr>
-          <w:b w:val="1"/>
-          <w:bCs w:val="1"/>
-          <w:rtl w:val="0"/>
-        </w:rPr>
-        <w:t xml:space="preserve">ANNA:</w:t>
-      </w:r>
-      <w:r>
-        <w:rPr>
-          <w:rtl w:val="0"/>
-        </w:rPr>
-        <w:t xml:space="preserve"> Äddi!</w:t>
+        <w:t xml:space="preserve">.</w:t>
+      </w:r>
+    </w:p>
+    <w:p>
+      <w:pPr>
+        <w:spacing w:after="120" w:lineRule="auto"/>
+        <w:rPr/>
+      </w:pPr>
+      <w:r>
+        <w:rPr>
+          <w:b w:val="1"/>
+          <w:bCs w:val="1"/>
+          <w:rtl w:val="0"/>
+        </w:rPr>
+        <w:t xml:space="preserve">TOM:</w:t>
+      </w:r>
+      <w:r>
+        <w:rPr>
+          <w:rtl w:val="0"/>
+        </w:rPr>
+        <w:t xml:space="preserve"> Thank you, everyone. Take care... and see you next time!</w:t>
+      </w:r>
+    </w:p>
+    <w:p>
+      <w:pPr>
+        <w:spacing w:after="120" w:lineRule="auto"/>
+        <w:rPr/>
+      </w:pPr>
+      <w:r>
+        <w:rPr>
+          <w:b w:val="1"/>
+          <w:bCs w:val="1"/>
+          <w:rtl w:val="0"/>
+        </w:rPr>
+        <w:t xml:space="preserve">ANNA:</w:t>
+      </w:r>
+      <w:r>
+        <w:rPr>
+          <w:rtl w:val="0"/>
+        </w:rPr>
+        <w:t xml:space="preserve"> Thank you so much for listening.</w:t>
       </w:r>
     </w:p>
     <w:p>
@@ -27044,7 +27036,7 @@
         <w:rPr>
           <w:rtl w:val="0"/>
         </w:rPr>
-        <w:t xml:space="preserve"> Hello, and welcome back! It's good to have you with us today.</w:t>
+        <w:t xml:space="preserve"> Hello, and welcome! It's really nice to have you with us today.</w:t>
       </w:r>
     </w:p>
     <w:p>
@@ -28460,47 +28452,47 @@
         <w:rPr>
           <w:rtl w:val="0"/>
         </w:rPr>
-        <w:t xml:space="preserve">. Thank you so much for listening today.</w:t>
-      </w:r>
-    </w:p>
-    <w:p>
-      <w:pPr>
-        <w:spacing w:after="120" w:lineRule="auto"/>
-        <w:rPr/>
-      </w:pPr>
-      <w:r>
-        <w:rPr>
-          <w:b w:val="1"/>
-          <w:bCs w:val="1"/>
-          <w:rtl w:val="0"/>
-        </w:rPr>
-        <w:t xml:space="preserve">TOM:</w:t>
-      </w:r>
-      <w:r>
-        <w:rPr>
-          <w:rtl w:val="0"/>
-        </w:rPr>
-        <w:t xml:space="preserve"> Take care, and see you in the next episode. Äddi!</w:t>
-      </w:r>
-    </w:p>
-    <w:p>
-      <w:pPr>
-        <w:spacing w:after="120" w:lineRule="auto"/>
-        <w:rPr/>
-      </w:pPr>
-      <w:r>
-        <w:rPr>
-          <w:b w:val="1"/>
-          <w:bCs w:val="1"/>
-          <w:rtl w:val="0"/>
-        </w:rPr>
-        <w:t xml:space="preserve">ANNA:</w:t>
-      </w:r>
-      <w:r>
-        <w:rPr>
-          <w:rtl w:val="0"/>
-        </w:rPr>
-        <w:t xml:space="preserve"> Äddi!</w:t>
+        <w:t xml:space="preserve">.</w:t>
+      </w:r>
+    </w:p>
+    <w:p>
+      <w:pPr>
+        <w:spacing w:after="120" w:lineRule="auto"/>
+        <w:rPr/>
+      </w:pPr>
+      <w:r>
+        <w:rPr>
+          <w:b w:val="1"/>
+          <w:bCs w:val="1"/>
+          <w:rtl w:val="0"/>
+        </w:rPr>
+        <w:t xml:space="preserve">TOM:</w:t>
+      </w:r>
+      <w:r>
+        <w:rPr>
+          <w:rtl w:val="0"/>
+        </w:rPr>
+        <w:t xml:space="preserve"> Thank you, everyone. Take care... and see you next time!</w:t>
+      </w:r>
+    </w:p>
+    <w:p>
+      <w:pPr>
+        <w:spacing w:after="120" w:lineRule="auto"/>
+        <w:rPr/>
+      </w:pPr>
+      <w:r>
+        <w:rPr>
+          <w:b w:val="1"/>
+          <w:bCs w:val="1"/>
+          <w:rtl w:val="0"/>
+        </w:rPr>
+        <w:t xml:space="preserve">ANNA:</w:t>
+      </w:r>
+      <w:r>
+        <w:rPr>
+          <w:rtl w:val="0"/>
+        </w:rPr>
+        <w:t xml:space="preserve"> Thank you so much for listening.</w:t>
       </w:r>
     </w:p>
     <w:p>
@@ -28585,7 +28577,7 @@
         <w:rPr>
           <w:rtl w:val="0"/>
         </w:rPr>
-        <w:t xml:space="preserve"> Hello, and welcome back! It's a pleasure to have you with us today.</w:t>
+        <w:t xml:space="preserve"> Hello, and welcome! It's really nice to have you with us today.</w:t>
       </w:r>
     </w:p>
     <w:p>
@@ -29799,7 +29791,7 @@
           <w:bCs w:val="1"/>
           <w:rtl w:val="0"/>
         </w:rPr>
-        <w:t xml:space="preserve">TOM:</w:t>
+        <w:t xml:space="preserve">ANNA:</w:t>
       </w:r>
       <w:r>
         <w:rPr>
@@ -29821,47 +29813,47 @@
         <w:rPr>
           <w:rtl w:val="0"/>
         </w:rPr>
-        <w:t xml:space="preserve">. Thank you so much for listening today.</w:t>
-      </w:r>
-    </w:p>
-    <w:p>
-      <w:pPr>
-        <w:spacing w:after="120" w:lineRule="auto"/>
-        <w:rPr/>
-      </w:pPr>
-      <w:r>
-        <w:rPr>
-          <w:b w:val="1"/>
-          <w:bCs w:val="1"/>
-          <w:rtl w:val="0"/>
-        </w:rPr>
-        <w:t xml:space="preserve">ANNA:</w:t>
-      </w:r>
-      <w:r>
-        <w:rPr>
-          <w:rtl w:val="0"/>
-        </w:rPr>
-        <w:t xml:space="preserve"> And remember... if you or a young person you know is struggling, reaching out is always okay. Äddi!</w:t>
-      </w:r>
-    </w:p>
-    <w:p>
-      <w:pPr>
-        <w:spacing w:after="120" w:lineRule="auto"/>
-        <w:rPr/>
-      </w:pPr>
-      <w:r>
-        <w:rPr>
-          <w:b w:val="1"/>
-          <w:bCs w:val="1"/>
-          <w:rtl w:val="0"/>
-        </w:rPr>
-        <w:t xml:space="preserve">TOM:</w:t>
-      </w:r>
-      <w:r>
-        <w:rPr>
-          <w:rtl w:val="0"/>
-        </w:rPr>
-        <w:t xml:space="preserve"> Äddi!</w:t>
+        <w:t xml:space="preserve">.</w:t>
+      </w:r>
+    </w:p>
+    <w:p>
+      <w:pPr>
+        <w:spacing w:after="120" w:lineRule="auto"/>
+        <w:rPr/>
+      </w:pPr>
+      <w:r>
+        <w:rPr>
+          <w:b w:val="1"/>
+          <w:bCs w:val="1"/>
+          <w:rtl w:val="0"/>
+        </w:rPr>
+        <w:t xml:space="preserve">TOM:</w:t>
+      </w:r>
+      <w:r>
+        <w:rPr>
+          <w:rtl w:val="0"/>
+        </w:rPr>
+        <w:t xml:space="preserve"> Thank you, everyone. Take care... and see you next time!</w:t>
+      </w:r>
+    </w:p>
+    <w:p>
+      <w:pPr>
+        <w:spacing w:after="120" w:lineRule="auto"/>
+        <w:rPr/>
+      </w:pPr>
+      <w:r>
+        <w:rPr>
+          <w:b w:val="1"/>
+          <w:bCs w:val="1"/>
+          <w:rtl w:val="0"/>
+        </w:rPr>
+        <w:t xml:space="preserve">ANNA:</w:t>
+      </w:r>
+      <w:r>
+        <w:rPr>
+          <w:rtl w:val="0"/>
+        </w:rPr>
+        <w:t xml:space="preserve"> Thank you so much for listening.</w:t>
       </w:r>
     </w:p>
     <w:p>
@@ -29946,7 +29938,7 @@
         <w:rPr>
           <w:rtl w:val="0"/>
         </w:rPr>
-        <w:t xml:space="preserve"> Hello, and welcome back! It's a pleasure to have you with us today.</w:t>
+        <w:t xml:space="preserve"> Hello, and welcome! It's really nice to have you with us today.</w:t>
       </w:r>
     </w:p>
     <w:p>
@@ -31120,7 +31112,7 @@
           <w:bCs w:val="1"/>
           <w:rtl w:val="0"/>
         </w:rPr>
-        <w:t xml:space="preserve">TOM:</w:t>
+        <w:t xml:space="preserve">ANNA:</w:t>
       </w:r>
       <w:r>
         <w:rPr>
@@ -31142,47 +31134,47 @@
         <w:rPr>
           <w:rtl w:val="0"/>
         </w:rPr>
-        <w:t xml:space="preserve">. Thank you so much for listening today.</w:t>
-      </w:r>
-    </w:p>
-    <w:p>
-      <w:pPr>
-        <w:spacing w:after="120" w:lineRule="auto"/>
-        <w:rPr/>
-      </w:pPr>
-      <w:r>
-        <w:rPr>
-          <w:b w:val="1"/>
-          <w:bCs w:val="1"/>
-          <w:rtl w:val="0"/>
-        </w:rPr>
-        <w:t xml:space="preserve">ANNA:</w:t>
-      </w:r>
-      <w:r>
-        <w:rPr>
-          <w:rtl w:val="0"/>
-        </w:rPr>
-        <w:t xml:space="preserve"> Take care, and see you in the next episode. Äddi!</w:t>
-      </w:r>
-    </w:p>
-    <w:p>
-      <w:pPr>
-        <w:spacing w:after="120" w:lineRule="auto"/>
-        <w:rPr/>
-      </w:pPr>
-      <w:r>
-        <w:rPr>
-          <w:b w:val="1"/>
-          <w:bCs w:val="1"/>
-          <w:rtl w:val="0"/>
-        </w:rPr>
-        <w:t xml:space="preserve">TOM:</w:t>
-      </w:r>
-      <w:r>
-        <w:rPr>
-          <w:rtl w:val="0"/>
-        </w:rPr>
-        <w:t xml:space="preserve"> Äddi!</w:t>
+        <w:t xml:space="preserve">.</w:t>
+      </w:r>
+    </w:p>
+    <w:p>
+      <w:pPr>
+        <w:spacing w:after="120" w:lineRule="auto"/>
+        <w:rPr/>
+      </w:pPr>
+      <w:r>
+        <w:rPr>
+          <w:b w:val="1"/>
+          <w:bCs w:val="1"/>
+          <w:rtl w:val="0"/>
+        </w:rPr>
+        <w:t xml:space="preserve">TOM:</w:t>
+      </w:r>
+      <w:r>
+        <w:rPr>
+          <w:rtl w:val="0"/>
+        </w:rPr>
+        <w:t xml:space="preserve"> Thank you, everyone. Take care... and see you next time!</w:t>
+      </w:r>
+    </w:p>
+    <w:p>
+      <w:pPr>
+        <w:spacing w:after="120" w:lineRule="auto"/>
+        <w:rPr/>
+      </w:pPr>
+      <w:r>
+        <w:rPr>
+          <w:b w:val="1"/>
+          <w:bCs w:val="1"/>
+          <w:rtl w:val="0"/>
+        </w:rPr>
+        <w:t xml:space="preserve">ANNA:</w:t>
+      </w:r>
+      <w:r>
+        <w:rPr>
+          <w:rtl w:val="0"/>
+        </w:rPr>
+        <w:t xml:space="preserve"> Thank you so much for listening.</w:t>
       </w:r>
     </w:p>
     <w:p>
@@ -31267,7 +31259,7 @@
         <w:rPr>
           <w:rtl w:val="0"/>
         </w:rPr>
-        <w:t xml:space="preserve"> Hello, and welcome back! It's lovely to have you with us today.</w:t>
+        <w:t xml:space="preserve"> Hello, and welcome! It's really nice to have you with us today.</w:t>
       </w:r>
     </w:p>
     <w:p>
@@ -32443,47 +32435,47 @@
         <w:rPr>
           <w:rtl w:val="0"/>
         </w:rPr>
-        <w:t xml:space="preserve">. Thank you so much for listening today.</w:t>
-      </w:r>
-    </w:p>
-    <w:p>
-      <w:pPr>
-        <w:spacing w:after="120" w:lineRule="auto"/>
-        <w:rPr/>
-      </w:pPr>
-      <w:r>
-        <w:rPr>
-          <w:b w:val="1"/>
-          <w:bCs w:val="1"/>
-          <w:rtl w:val="0"/>
-        </w:rPr>
-        <w:t xml:space="preserve">TOM:</w:t>
-      </w:r>
-      <w:r>
-        <w:rPr>
-          <w:rtl w:val="0"/>
-        </w:rPr>
-        <w:t xml:space="preserve"> Take care, and see you in the next episode. Äddi!</w:t>
-      </w:r>
-    </w:p>
-    <w:p>
-      <w:pPr>
-        <w:spacing w:after="120" w:lineRule="auto"/>
-        <w:rPr/>
-      </w:pPr>
-      <w:r>
-        <w:rPr>
-          <w:b w:val="1"/>
-          <w:bCs w:val="1"/>
-          <w:rtl w:val="0"/>
-        </w:rPr>
-        <w:t xml:space="preserve">ANNA:</w:t>
-      </w:r>
-      <w:r>
-        <w:rPr>
-          <w:rtl w:val="0"/>
-        </w:rPr>
-        <w:t xml:space="preserve"> Äddi!</w:t>
+        <w:t xml:space="preserve">.</w:t>
+      </w:r>
+    </w:p>
+    <w:p>
+      <w:pPr>
+        <w:spacing w:after="120" w:lineRule="auto"/>
+        <w:rPr/>
+      </w:pPr>
+      <w:r>
+        <w:rPr>
+          <w:b w:val="1"/>
+          <w:bCs w:val="1"/>
+          <w:rtl w:val="0"/>
+        </w:rPr>
+        <w:t xml:space="preserve">TOM:</w:t>
+      </w:r>
+      <w:r>
+        <w:rPr>
+          <w:rtl w:val="0"/>
+        </w:rPr>
+        <w:t xml:space="preserve"> Thank you, everyone. Take care... and see you next time!</w:t>
+      </w:r>
+    </w:p>
+    <w:p>
+      <w:pPr>
+        <w:spacing w:after="120" w:lineRule="auto"/>
+        <w:rPr/>
+      </w:pPr>
+      <w:r>
+        <w:rPr>
+          <w:b w:val="1"/>
+          <w:bCs w:val="1"/>
+          <w:rtl w:val="0"/>
+        </w:rPr>
+        <w:t xml:space="preserve">ANNA:</w:t>
+      </w:r>
+      <w:r>
+        <w:rPr>
+          <w:rtl w:val="0"/>
+        </w:rPr>
+        <w:t xml:space="preserve"> Thank you so much for listening.</w:t>
       </w:r>
     </w:p>
     <w:p>
@@ -32568,7 +32560,7 @@
         <w:rPr>
           <w:rtl w:val="0"/>
         </w:rPr>
-        <w:t xml:space="preserve"> Hello, and welcome back! It's good to have you with us today.</w:t>
+        <w:t xml:space="preserve"> Hello, and welcome! It's really nice to have you with us today.</w:t>
       </w:r>
     </w:p>
     <w:p>
@@ -34104,47 +34096,47 @@
         <w:rPr>
           <w:rtl w:val="0"/>
         </w:rPr>
-        <w:t xml:space="preserve">. Thank you so much for listening.</w:t>
-      </w:r>
-    </w:p>
-    <w:p>
-      <w:pPr>
-        <w:spacing w:after="120" w:lineRule="auto"/>
-        <w:rPr/>
-      </w:pPr>
-      <w:r>
-        <w:rPr>
-          <w:b w:val="1"/>
-          <w:bCs w:val="1"/>
-          <w:rtl w:val="0"/>
-        </w:rPr>
-        <w:t xml:space="preserve">TOM:</w:t>
-      </w:r>
-      <w:r>
-        <w:rPr>
-          <w:rtl w:val="0"/>
-        </w:rPr>
-        <w:t xml:space="preserve"> Take care, stay safe, and see you in the next episode. Äddi!</w:t>
-      </w:r>
-    </w:p>
-    <w:p>
-      <w:pPr>
-        <w:spacing w:after="120" w:lineRule="auto"/>
-        <w:rPr/>
-      </w:pPr>
-      <w:r>
-        <w:rPr>
-          <w:b w:val="1"/>
-          <w:bCs w:val="1"/>
-          <w:rtl w:val="0"/>
-        </w:rPr>
-        <w:t xml:space="preserve">ANNA:</w:t>
-      </w:r>
-      <w:r>
-        <w:rPr>
-          <w:rtl w:val="0"/>
-        </w:rPr>
-        <w:t xml:space="preserve"> Äddi!</w:t>
+        <w:t xml:space="preserve">.</w:t>
+      </w:r>
+    </w:p>
+    <w:p>
+      <w:pPr>
+        <w:spacing w:after="120" w:lineRule="auto"/>
+        <w:rPr/>
+      </w:pPr>
+      <w:r>
+        <w:rPr>
+          <w:b w:val="1"/>
+          <w:bCs w:val="1"/>
+          <w:rtl w:val="0"/>
+        </w:rPr>
+        <w:t xml:space="preserve">TOM:</w:t>
+      </w:r>
+      <w:r>
+        <w:rPr>
+          <w:rtl w:val="0"/>
+        </w:rPr>
+        <w:t xml:space="preserve"> Thank you, everyone. Take care... and see you next time!</w:t>
+      </w:r>
+    </w:p>
+    <w:p>
+      <w:pPr>
+        <w:spacing w:after="120" w:lineRule="auto"/>
+        <w:rPr/>
+      </w:pPr>
+      <w:r>
+        <w:rPr>
+          <w:b w:val="1"/>
+          <w:bCs w:val="1"/>
+          <w:rtl w:val="0"/>
+        </w:rPr>
+        <w:t xml:space="preserve">ANNA:</w:t>
+      </w:r>
+      <w:r>
+        <w:rPr>
+          <w:rtl w:val="0"/>
+        </w:rPr>
+        <w:t xml:space="preserve"> Thank you so much for listening.</w:t>
       </w:r>
     </w:p>
     <w:p>
@@ -34229,7 +34221,7 @@
         <w:rPr>
           <w:rtl w:val="0"/>
         </w:rPr>
-        <w:t xml:space="preserve"> Hello, and welcome back! It's lovely to have you with us today.</w:t>
+        <w:t xml:space="preserve"> Hello, and welcome! It's really nice to have you with us today.</w:t>
       </w:r>
     </w:p>
     <w:p>
@@ -35365,47 +35357,47 @@
         <w:rPr>
           <w:rtl w:val="0"/>
         </w:rPr>
-        <w:t xml:space="preserve">. Thank you so much for listening today.</w:t>
-      </w:r>
-    </w:p>
-    <w:p>
-      <w:pPr>
-        <w:spacing w:after="120" w:lineRule="auto"/>
-        <w:rPr/>
-      </w:pPr>
-      <w:r>
-        <w:rPr>
-          <w:b w:val="1"/>
-          <w:bCs w:val="1"/>
-          <w:rtl w:val="0"/>
-        </w:rPr>
-        <w:t xml:space="preserve">TOM:</w:t>
-      </w:r>
-      <w:r>
-        <w:rPr>
-          <w:rtl w:val="0"/>
-        </w:rPr>
-        <w:t xml:space="preserve"> Take care, and see you in the next episode. Äddi!</w:t>
-      </w:r>
-    </w:p>
-    <w:p>
-      <w:pPr>
-        <w:spacing w:after="120" w:lineRule="auto"/>
-        <w:rPr/>
-      </w:pPr>
-      <w:r>
-        <w:rPr>
-          <w:b w:val="1"/>
-          <w:bCs w:val="1"/>
-          <w:rtl w:val="0"/>
-        </w:rPr>
-        <w:t xml:space="preserve">ANNA:</w:t>
-      </w:r>
-      <w:r>
-        <w:rPr>
-          <w:rtl w:val="0"/>
-        </w:rPr>
-        <w:t xml:space="preserve"> Äddi!</w:t>
+        <w:t xml:space="preserve">.</w:t>
+      </w:r>
+    </w:p>
+    <w:p>
+      <w:pPr>
+        <w:spacing w:after="120" w:lineRule="auto"/>
+        <w:rPr/>
+      </w:pPr>
+      <w:r>
+        <w:rPr>
+          <w:b w:val="1"/>
+          <w:bCs w:val="1"/>
+          <w:rtl w:val="0"/>
+        </w:rPr>
+        <w:t xml:space="preserve">TOM:</w:t>
+      </w:r>
+      <w:r>
+        <w:rPr>
+          <w:rtl w:val="0"/>
+        </w:rPr>
+        <w:t xml:space="preserve"> Thank you, everyone. Take care... and see you next time!</w:t>
+      </w:r>
+    </w:p>
+    <w:p>
+      <w:pPr>
+        <w:spacing w:after="120" w:lineRule="auto"/>
+        <w:rPr/>
+      </w:pPr>
+      <w:r>
+        <w:rPr>
+          <w:b w:val="1"/>
+          <w:bCs w:val="1"/>
+          <w:rtl w:val="0"/>
+        </w:rPr>
+        <w:t xml:space="preserve">ANNA:</w:t>
+      </w:r>
+      <w:r>
+        <w:rPr>
+          <w:rtl w:val="0"/>
+        </w:rPr>
+        <w:t xml:space="preserve"> Thank you so much for listening.</w:t>
       </w:r>
     </w:p>
     <w:p>
@@ -35490,7 +35482,7 @@
         <w:rPr>
           <w:rtl w:val="0"/>
         </w:rPr>
-        <w:t xml:space="preserve"> Hello, and welcome back! It's good to have you with us today.</w:t>
+        <w:t xml:space="preserve"> Hello, and welcome! It's really nice to have you with us today.</w:t>
       </w:r>
     </w:p>
     <w:p>
@@ -36626,47 +36618,47 @@
         <w:rPr>
           <w:rtl w:val="0"/>
         </w:rPr>
-        <w:t xml:space="preserve">. Thank you so much for listening today.</w:t>
-      </w:r>
-    </w:p>
-    <w:p>
-      <w:pPr>
-        <w:spacing w:after="120" w:lineRule="auto"/>
-        <w:rPr/>
-      </w:pPr>
-      <w:r>
-        <w:rPr>
-          <w:b w:val="1"/>
-          <w:bCs w:val="1"/>
-          <w:rtl w:val="0"/>
-        </w:rPr>
-        <w:t xml:space="preserve">TOM:</w:t>
-      </w:r>
-      <w:r>
-        <w:rPr>
-          <w:rtl w:val="0"/>
-        </w:rPr>
-        <w:t xml:space="preserve"> Take care of yourselves and of our shared home. See you in the next episode. Äddi!</w:t>
-      </w:r>
-    </w:p>
-    <w:p>
-      <w:pPr>
-        <w:spacing w:after="120" w:lineRule="auto"/>
-        <w:rPr/>
-      </w:pPr>
-      <w:r>
-        <w:rPr>
-          <w:b w:val="1"/>
-          <w:bCs w:val="1"/>
-          <w:rtl w:val="0"/>
-        </w:rPr>
-        <w:t xml:space="preserve">ANNA:</w:t>
-      </w:r>
-      <w:r>
-        <w:rPr>
-          <w:rtl w:val="0"/>
-        </w:rPr>
-        <w:t xml:space="preserve"> Äddi!</w:t>
+        <w:t xml:space="preserve">.</w:t>
+      </w:r>
+    </w:p>
+    <w:p>
+      <w:pPr>
+        <w:spacing w:after="120" w:lineRule="auto"/>
+        <w:rPr/>
+      </w:pPr>
+      <w:r>
+        <w:rPr>
+          <w:b w:val="1"/>
+          <w:bCs w:val="1"/>
+          <w:rtl w:val="0"/>
+        </w:rPr>
+        <w:t xml:space="preserve">TOM:</w:t>
+      </w:r>
+      <w:r>
+        <w:rPr>
+          <w:rtl w:val="0"/>
+        </w:rPr>
+        <w:t xml:space="preserve"> Thank you, everyone. Take care... and see you next time!</w:t>
+      </w:r>
+    </w:p>
+    <w:p>
+      <w:pPr>
+        <w:spacing w:after="120" w:lineRule="auto"/>
+        <w:rPr/>
+      </w:pPr>
+      <w:r>
+        <w:rPr>
+          <w:b w:val="1"/>
+          <w:bCs w:val="1"/>
+          <w:rtl w:val="0"/>
+        </w:rPr>
+        <w:t xml:space="preserve">ANNA:</w:t>
+      </w:r>
+      <w:r>
+        <w:rPr>
+          <w:rtl w:val="0"/>
+        </w:rPr>
+        <w:t xml:space="preserve"> Thank you so much for listening.</w:t>
       </w:r>
     </w:p>
     <w:p>
@@ -36751,7 +36743,7 @@
         <w:rPr>
           <w:rtl w:val="0"/>
         </w:rPr>
-        <w:t xml:space="preserve"> Hello, and welcome back! It's a pleasure to have you with us today.</w:t>
+        <w:t xml:space="preserve"> Hello, and welcome! It's really nice to have you with us today.</w:t>
       </w:r>
     </w:p>
     <w:p>
@@ -37765,7 +37757,7 @@
           <w:bCs w:val="1"/>
           <w:rtl w:val="0"/>
         </w:rPr>
-        <w:t xml:space="preserve">TOM:</w:t>
+        <w:t xml:space="preserve">ANNA:</w:t>
       </w:r>
       <w:r>
         <w:rPr>
@@ -37787,47 +37779,47 @@
         <w:rPr>
           <w:rtl w:val="0"/>
         </w:rPr>
-        <w:t xml:space="preserve">. Thank you so much for listening today.</w:t>
-      </w:r>
-    </w:p>
-    <w:p>
-      <w:pPr>
-        <w:spacing w:after="120" w:lineRule="auto"/>
-        <w:rPr/>
-      </w:pPr>
-      <w:r>
-        <w:rPr>
-          <w:b w:val="1"/>
-          <w:bCs w:val="1"/>
-          <w:rtl w:val="0"/>
-        </w:rPr>
-        <w:t xml:space="preserve">ANNA:</w:t>
-      </w:r>
-      <w:r>
-        <w:rPr>
-          <w:rtl w:val="0"/>
-        </w:rPr>
-        <w:t xml:space="preserve"> Take care, and see you in the next episode. Äddi!</w:t>
-      </w:r>
-    </w:p>
-    <w:p>
-      <w:pPr>
-        <w:spacing w:after="120" w:lineRule="auto"/>
-        <w:rPr/>
-      </w:pPr>
-      <w:r>
-        <w:rPr>
-          <w:b w:val="1"/>
-          <w:bCs w:val="1"/>
-          <w:rtl w:val="0"/>
-        </w:rPr>
-        <w:t xml:space="preserve">TOM:</w:t>
-      </w:r>
-      <w:r>
-        <w:rPr>
-          <w:rtl w:val="0"/>
-        </w:rPr>
-        <w:t xml:space="preserve"> Äddi!</w:t>
+        <w:t xml:space="preserve">.</w:t>
+      </w:r>
+    </w:p>
+    <w:p>
+      <w:pPr>
+        <w:spacing w:after="120" w:lineRule="auto"/>
+        <w:rPr/>
+      </w:pPr>
+      <w:r>
+        <w:rPr>
+          <w:b w:val="1"/>
+          <w:bCs w:val="1"/>
+          <w:rtl w:val="0"/>
+        </w:rPr>
+        <w:t xml:space="preserve">TOM:</w:t>
+      </w:r>
+      <w:r>
+        <w:rPr>
+          <w:rtl w:val="0"/>
+        </w:rPr>
+        <w:t xml:space="preserve"> Thank you, everyone. Take care... and see you next time!</w:t>
+      </w:r>
+    </w:p>
+    <w:p>
+      <w:pPr>
+        <w:spacing w:after="120" w:lineRule="auto"/>
+        <w:rPr/>
+      </w:pPr>
+      <w:r>
+        <w:rPr>
+          <w:b w:val="1"/>
+          <w:bCs w:val="1"/>
+          <w:rtl w:val="0"/>
+        </w:rPr>
+        <w:t xml:space="preserve">ANNA:</w:t>
+      </w:r>
+      <w:r>
+        <w:rPr>
+          <w:rtl w:val="0"/>
+        </w:rPr>
+        <w:t xml:space="preserve"> Thank you so much for listening.</w:t>
       </w:r>
     </w:p>
     <w:p>
@@ -37912,7 +37904,7 @@
         <w:rPr>
           <w:rtl w:val="0"/>
         </w:rPr>
-        <w:t xml:space="preserve"> Hello, and welcome back! It's wonderful to have you with us today.</w:t>
+        <w:t xml:space="preserve"> Hello, and welcome! It's really nice to have you with us today.</w:t>
       </w:r>
     </w:p>
     <w:p>
@@ -39008,47 +39000,47 @@
         <w:rPr>
           <w:rtl w:val="0"/>
         </w:rPr>
-        <w:t xml:space="preserve">. Thank you so much for listening today.</w:t>
-      </w:r>
-    </w:p>
-    <w:p>
-      <w:pPr>
-        <w:spacing w:after="120" w:lineRule="auto"/>
-        <w:rPr/>
-      </w:pPr>
-      <w:r>
-        <w:rPr>
-          <w:b w:val="1"/>
-          <w:bCs w:val="1"/>
-          <w:rtl w:val="0"/>
-        </w:rPr>
-        <w:t xml:space="preserve">TOM:</w:t>
-      </w:r>
-      <w:r>
-        <w:rPr>
-          <w:rtl w:val="0"/>
-        </w:rPr>
-        <w:t xml:space="preserve"> Take care, stay curious, and see you in the next episode. Äddi!</w:t>
-      </w:r>
-    </w:p>
-    <w:p>
-      <w:pPr>
-        <w:spacing w:after="120" w:lineRule="auto"/>
-        <w:rPr/>
-      </w:pPr>
-      <w:r>
-        <w:rPr>
-          <w:b w:val="1"/>
-          <w:bCs w:val="1"/>
-          <w:rtl w:val="0"/>
-        </w:rPr>
-        <w:t xml:space="preserve">ANNA:</w:t>
-      </w:r>
-      <w:r>
-        <w:rPr>
-          <w:rtl w:val="0"/>
-        </w:rPr>
-        <w:t xml:space="preserve"> Äddi!</w:t>
+        <w:t xml:space="preserve">.</w:t>
+      </w:r>
+    </w:p>
+    <w:p>
+      <w:pPr>
+        <w:spacing w:after="120" w:lineRule="auto"/>
+        <w:rPr/>
+      </w:pPr>
+      <w:r>
+        <w:rPr>
+          <w:b w:val="1"/>
+          <w:bCs w:val="1"/>
+          <w:rtl w:val="0"/>
+        </w:rPr>
+        <w:t xml:space="preserve">TOM:</w:t>
+      </w:r>
+      <w:r>
+        <w:rPr>
+          <w:rtl w:val="0"/>
+        </w:rPr>
+        <w:t xml:space="preserve"> Thank you, everyone. Take care... and see you next time!</w:t>
+      </w:r>
+    </w:p>
+    <w:p>
+      <w:pPr>
+        <w:spacing w:after="120" w:lineRule="auto"/>
+        <w:rPr/>
+      </w:pPr>
+      <w:r>
+        <w:rPr>
+          <w:b w:val="1"/>
+          <w:bCs w:val="1"/>
+          <w:rtl w:val="0"/>
+        </w:rPr>
+        <w:t xml:space="preserve">ANNA:</w:t>
+      </w:r>
+      <w:r>
+        <w:rPr>
+          <w:rtl w:val="0"/>
+        </w:rPr>
+        <w:t xml:space="preserve"> Thank you so much for listening.</w:t>
       </w:r>
     </w:p>
     <w:p>
@@ -39133,7 +39125,7 @@
         <w:rPr>
           <w:rtl w:val="0"/>
         </w:rPr>
-        <w:t xml:space="preserve"> Hello, and welcome back! It's lovely to have you with us today.</w:t>
+        <w:t xml:space="preserve"> Hello, and welcome! It's really nice to have you with us today.</w:t>
       </w:r>
     </w:p>
     <w:p>
@@ -40347,7 +40339,7 @@
           <w:bCs w:val="1"/>
           <w:rtl w:val="0"/>
         </w:rPr>
-        <w:t xml:space="preserve">TOM:</w:t>
+        <w:t xml:space="preserve">ANNA:</w:t>
       </w:r>
       <w:r>
         <w:rPr>
@@ -40369,47 +40361,47 @@
         <w:rPr>
           <w:rtl w:val="0"/>
         </w:rPr>
-        <w:t xml:space="preserve">. Thank you so much for listening today.</w:t>
-      </w:r>
-    </w:p>
-    <w:p>
-      <w:pPr>
-        <w:spacing w:after="120" w:lineRule="auto"/>
-        <w:rPr/>
-      </w:pPr>
-      <w:r>
-        <w:rPr>
-          <w:b w:val="1"/>
-          <w:bCs w:val="1"/>
-          <w:rtl w:val="0"/>
-        </w:rPr>
-        <w:t xml:space="preserve">ANNA:</w:t>
-      </w:r>
-      <w:r>
-        <w:rPr>
-          <w:rtl w:val="0"/>
-        </w:rPr>
-        <w:t xml:space="preserve"> Take care, eat well, and see you in the next episode. Äddi!</w:t>
-      </w:r>
-    </w:p>
-    <w:p>
-      <w:pPr>
-        <w:spacing w:after="120" w:lineRule="auto"/>
-        <w:rPr/>
-      </w:pPr>
-      <w:r>
-        <w:rPr>
-          <w:b w:val="1"/>
-          <w:bCs w:val="1"/>
-          <w:rtl w:val="0"/>
-        </w:rPr>
-        <w:t xml:space="preserve">TOM:</w:t>
-      </w:r>
-      <w:r>
-        <w:rPr>
-          <w:rtl w:val="0"/>
-        </w:rPr>
-        <w:t xml:space="preserve"> Äddi!</w:t>
+        <w:t xml:space="preserve">.</w:t>
+      </w:r>
+    </w:p>
+    <w:p>
+      <w:pPr>
+        <w:spacing w:after="120" w:lineRule="auto"/>
+        <w:rPr/>
+      </w:pPr>
+      <w:r>
+        <w:rPr>
+          <w:b w:val="1"/>
+          <w:bCs w:val="1"/>
+          <w:rtl w:val="0"/>
+        </w:rPr>
+        <w:t xml:space="preserve">TOM:</w:t>
+      </w:r>
+      <w:r>
+        <w:rPr>
+          <w:rtl w:val="0"/>
+        </w:rPr>
+        <w:t xml:space="preserve"> Thank you, everyone. Take care... and see you next time!</w:t>
+      </w:r>
+    </w:p>
+    <w:p>
+      <w:pPr>
+        <w:spacing w:after="120" w:lineRule="auto"/>
+        <w:rPr/>
+      </w:pPr>
+      <w:r>
+        <w:rPr>
+          <w:b w:val="1"/>
+          <w:bCs w:val="1"/>
+          <w:rtl w:val="0"/>
+        </w:rPr>
+        <w:t xml:space="preserve">ANNA:</w:t>
+      </w:r>
+      <w:r>
+        <w:rPr>
+          <w:rtl w:val="0"/>
+        </w:rPr>
+        <w:t xml:space="preserve"> Thank you so much for listening.</w:t>
       </w:r>
     </w:p>
     <w:p>
@@ -40494,7 +40486,7 @@
         <w:rPr>
           <w:rtl w:val="0"/>
         </w:rPr>
-        <w:t xml:space="preserve"> Hello, and welcome back! It's lovely to have you with us today.</w:t>
+        <w:t xml:space="preserve"> Hello, and welcome! It's really nice to have you with us today.</w:t>
       </w:r>
     </w:p>
     <w:p>
@@ -41550,47 +41542,47 @@
         <w:rPr>
           <w:rtl w:val="0"/>
         </w:rPr>
-        <w:t xml:space="preserve">. Thank you so much for listening today.</w:t>
-      </w:r>
-    </w:p>
-    <w:p>
-      <w:pPr>
-        <w:spacing w:after="120" w:lineRule="auto"/>
-        <w:rPr/>
-      </w:pPr>
-      <w:r>
-        <w:rPr>
-          <w:b w:val="1"/>
-          <w:bCs w:val="1"/>
-          <w:rtl w:val="0"/>
-        </w:rPr>
-        <w:t xml:space="preserve">TOM:</w:t>
-      </w:r>
-      <w:r>
-        <w:rPr>
-          <w:rtl w:val="0"/>
-        </w:rPr>
-        <w:t xml:space="preserve"> Take care, and see you in the next episode. Äddi!</w:t>
-      </w:r>
-    </w:p>
-    <w:p>
-      <w:pPr>
-        <w:spacing w:after="120" w:lineRule="auto"/>
-        <w:rPr/>
-      </w:pPr>
-      <w:r>
-        <w:rPr>
-          <w:b w:val="1"/>
-          <w:bCs w:val="1"/>
-          <w:rtl w:val="0"/>
-        </w:rPr>
-        <w:t xml:space="preserve">ANNA:</w:t>
-      </w:r>
-      <w:r>
-        <w:rPr>
-          <w:rtl w:val="0"/>
-        </w:rPr>
-        <w:t xml:space="preserve"> Äddi!</w:t>
+        <w:t xml:space="preserve">.</w:t>
+      </w:r>
+    </w:p>
+    <w:p>
+      <w:pPr>
+        <w:spacing w:after="120" w:lineRule="auto"/>
+        <w:rPr/>
+      </w:pPr>
+      <w:r>
+        <w:rPr>
+          <w:b w:val="1"/>
+          <w:bCs w:val="1"/>
+          <w:rtl w:val="0"/>
+        </w:rPr>
+        <w:t xml:space="preserve">TOM:</w:t>
+      </w:r>
+      <w:r>
+        <w:rPr>
+          <w:rtl w:val="0"/>
+        </w:rPr>
+        <w:t xml:space="preserve"> Thank you, everyone. Take care... and see you next time!</w:t>
+      </w:r>
+    </w:p>
+    <w:p>
+      <w:pPr>
+        <w:spacing w:after="120" w:lineRule="auto"/>
+        <w:rPr/>
+      </w:pPr>
+      <w:r>
+        <w:rPr>
+          <w:b w:val="1"/>
+          <w:bCs w:val="1"/>
+          <w:rtl w:val="0"/>
+        </w:rPr>
+        <w:t xml:space="preserve">ANNA:</w:t>
+      </w:r>
+      <w:r>
+        <w:rPr>
+          <w:rtl w:val="0"/>
+        </w:rPr>
+        <w:t xml:space="preserve"> Thank you so much for listening.</w:t>
       </w:r>
     </w:p>
     <w:p>
@@ -41675,7 +41667,7 @@
         <w:rPr>
           <w:rtl w:val="0"/>
         </w:rPr>
-        <w:t xml:space="preserve"> Hello, and welcome back! It's good to have you with us today.</w:t>
+        <w:t xml:space="preserve"> Hello, and welcome! It's really nice to have you with us today.</w:t>
       </w:r>
     </w:p>
     <w:p>
@@ -42769,7 +42761,7 @@
           <w:bCs w:val="1"/>
           <w:rtl w:val="0"/>
         </w:rPr>
-        <w:t xml:space="preserve">TOM:</w:t>
+        <w:t xml:space="preserve">ANNA:</w:t>
       </w:r>
       <w:r>
         <w:rPr>
@@ -42791,47 +42783,47 @@
         <w:rPr>
           <w:rtl w:val="0"/>
         </w:rPr>
-        <w:t xml:space="preserve">. Thank you so much for listening today.</w:t>
-      </w:r>
-    </w:p>
-    <w:p>
-      <w:pPr>
-        <w:spacing w:after="120" w:lineRule="auto"/>
-        <w:rPr/>
-      </w:pPr>
-      <w:r>
-        <w:rPr>
-          <w:b w:val="1"/>
-          <w:bCs w:val="1"/>
-          <w:rtl w:val="0"/>
-        </w:rPr>
-        <w:t xml:space="preserve">ANNA:</w:t>
-      </w:r>
-      <w:r>
-        <w:rPr>
-          <w:rtl w:val="0"/>
-        </w:rPr>
-        <w:t xml:space="preserve"> Take care, stay safe, and see you in the next episode. Äddi!</w:t>
-      </w:r>
-    </w:p>
-    <w:p>
-      <w:pPr>
-        <w:spacing w:after="120" w:lineRule="auto"/>
-        <w:rPr/>
-      </w:pPr>
-      <w:r>
-        <w:rPr>
-          <w:b w:val="1"/>
-          <w:bCs w:val="1"/>
-          <w:rtl w:val="0"/>
-        </w:rPr>
-        <w:t xml:space="preserve">TOM:</w:t>
-      </w:r>
-      <w:r>
-        <w:rPr>
-          <w:rtl w:val="0"/>
-        </w:rPr>
-        <w:t xml:space="preserve"> Äddi!</w:t>
+        <w:t xml:space="preserve">.</w:t>
+      </w:r>
+    </w:p>
+    <w:p>
+      <w:pPr>
+        <w:spacing w:after="120" w:lineRule="auto"/>
+        <w:rPr/>
+      </w:pPr>
+      <w:r>
+        <w:rPr>
+          <w:b w:val="1"/>
+          <w:bCs w:val="1"/>
+          <w:rtl w:val="0"/>
+        </w:rPr>
+        <w:t xml:space="preserve">TOM:</w:t>
+      </w:r>
+      <w:r>
+        <w:rPr>
+          <w:rtl w:val="0"/>
+        </w:rPr>
+        <w:t xml:space="preserve"> Thank you, everyone. Take care... and see you next time!</w:t>
+      </w:r>
+    </w:p>
+    <w:p>
+      <w:pPr>
+        <w:spacing w:after="120" w:lineRule="auto"/>
+        <w:rPr/>
+      </w:pPr>
+      <w:r>
+        <w:rPr>
+          <w:b w:val="1"/>
+          <w:bCs w:val="1"/>
+          <w:rtl w:val="0"/>
+        </w:rPr>
+        <w:t xml:space="preserve">ANNA:</w:t>
+      </w:r>
+      <w:r>
+        <w:rPr>
+          <w:rtl w:val="0"/>
+        </w:rPr>
+        <w:t xml:space="preserve"> Thank you so much for listening.</w:t>
       </w:r>
     </w:p>
     <w:p>
@@ -42916,7 +42908,7 @@
         <w:rPr>
           <w:rtl w:val="0"/>
         </w:rPr>
-        <w:t xml:space="preserve"> Hello, and welcome back! It's a pleasure to have you with us today.</w:t>
+        <w:t xml:space="preserve"> Hello, and welcome! It's really nice to have you with us today.</w:t>
       </w:r>
     </w:p>
     <w:p>
@@ -43892,47 +43884,47 @@
         <w:rPr>
           <w:rtl w:val="0"/>
         </w:rPr>
-        <w:t xml:space="preserve">. Thank you so much for listening today.</w:t>
-      </w:r>
-    </w:p>
-    <w:p>
-      <w:pPr>
-        <w:spacing w:after="120" w:lineRule="auto"/>
-        <w:rPr/>
-      </w:pPr>
-      <w:r>
-        <w:rPr>
-          <w:b w:val="1"/>
-          <w:bCs w:val="1"/>
-          <w:rtl w:val="0"/>
-        </w:rPr>
-        <w:t xml:space="preserve">TOM:</w:t>
-      </w:r>
-      <w:r>
-        <w:rPr>
-          <w:rtl w:val="0"/>
-        </w:rPr>
-        <w:t xml:space="preserve"> Take care, go and explore, and see you in the next episode. Äddi!</w:t>
-      </w:r>
-    </w:p>
-    <w:p>
-      <w:pPr>
-        <w:spacing w:after="120" w:lineRule="auto"/>
-        <w:rPr/>
-      </w:pPr>
-      <w:r>
-        <w:rPr>
-          <w:b w:val="1"/>
-          <w:bCs w:val="1"/>
-          <w:rtl w:val="0"/>
-        </w:rPr>
-        <w:t xml:space="preserve">ANNA:</w:t>
-      </w:r>
-      <w:r>
-        <w:rPr>
-          <w:rtl w:val="0"/>
-        </w:rPr>
-        <w:t xml:space="preserve"> Äddi!</w:t>
+        <w:t xml:space="preserve">.</w:t>
+      </w:r>
+    </w:p>
+    <w:p>
+      <w:pPr>
+        <w:spacing w:after="120" w:lineRule="auto"/>
+        <w:rPr/>
+      </w:pPr>
+      <w:r>
+        <w:rPr>
+          <w:b w:val="1"/>
+          <w:bCs w:val="1"/>
+          <w:rtl w:val="0"/>
+        </w:rPr>
+        <w:t xml:space="preserve">TOM:</w:t>
+      </w:r>
+      <w:r>
+        <w:rPr>
+          <w:rtl w:val="0"/>
+        </w:rPr>
+        <w:t xml:space="preserve"> Thank you, everyone. Take care... and see you next time!</w:t>
+      </w:r>
+    </w:p>
+    <w:p>
+      <w:pPr>
+        <w:spacing w:after="120" w:lineRule="auto"/>
+        <w:rPr/>
+      </w:pPr>
+      <w:r>
+        <w:rPr>
+          <w:b w:val="1"/>
+          <w:bCs w:val="1"/>
+          <w:rtl w:val="0"/>
+        </w:rPr>
+        <w:t xml:space="preserve">ANNA:</w:t>
+      </w:r>
+      <w:r>
+        <w:rPr>
+          <w:rtl w:val="0"/>
+        </w:rPr>
+        <w:t xml:space="preserve"> Thank you so much for listening.</w:t>
       </w:r>
     </w:p>
     <w:p>
@@ -44017,7 +44009,7 @@
         <w:rPr>
           <w:rtl w:val="0"/>
         </w:rPr>
-        <w:t xml:space="preserve"> Hello, and welcome back! It's good to have you with us today.</w:t>
+        <w:t xml:space="preserve"> Hello, and welcome! It's really nice to have you with us today.</w:t>
       </w:r>
     </w:p>
     <w:p>
@@ -45071,7 +45063,7 @@
           <w:bCs w:val="1"/>
           <w:rtl w:val="0"/>
         </w:rPr>
-        <w:t xml:space="preserve">TOM:</w:t>
+        <w:t xml:space="preserve">ANNA:</w:t>
       </w:r>
       <w:r>
         <w:rPr>
@@ -45093,47 +45085,47 @@
         <w:rPr>
           <w:rtl w:val="0"/>
         </w:rPr>
-        <w:t xml:space="preserve">. Thank you so much for listening today.</w:t>
-      </w:r>
-    </w:p>
-    <w:p>
-      <w:pPr>
-        <w:spacing w:after="120" w:lineRule="auto"/>
-        <w:rPr/>
-      </w:pPr>
-      <w:r>
-        <w:rPr>
-          <w:b w:val="1"/>
-          <w:bCs w:val="1"/>
-          <w:rtl w:val="0"/>
-        </w:rPr>
-        <w:t xml:space="preserve">ANNA:</w:t>
-      </w:r>
-      <w:r>
-        <w:rPr>
-          <w:rtl w:val="0"/>
-        </w:rPr>
-        <w:t xml:space="preserve"> Take care, stay safe online, and see you in the next episode. Äddi!</w:t>
-      </w:r>
-    </w:p>
-    <w:p>
-      <w:pPr>
-        <w:spacing w:after="120" w:lineRule="auto"/>
-        <w:rPr/>
-      </w:pPr>
-      <w:r>
-        <w:rPr>
-          <w:b w:val="1"/>
-          <w:bCs w:val="1"/>
-          <w:rtl w:val="0"/>
-        </w:rPr>
-        <w:t xml:space="preserve">TOM:</w:t>
-      </w:r>
-      <w:r>
-        <w:rPr>
-          <w:rtl w:val="0"/>
-        </w:rPr>
-        <w:t xml:space="preserve"> Äddi!</w:t>
+        <w:t xml:space="preserve">.</w:t>
+      </w:r>
+    </w:p>
+    <w:p>
+      <w:pPr>
+        <w:spacing w:after="120" w:lineRule="auto"/>
+        <w:rPr/>
+      </w:pPr>
+      <w:r>
+        <w:rPr>
+          <w:b w:val="1"/>
+          <w:bCs w:val="1"/>
+          <w:rtl w:val="0"/>
+        </w:rPr>
+        <w:t xml:space="preserve">TOM:</w:t>
+      </w:r>
+      <w:r>
+        <w:rPr>
+          <w:rtl w:val="0"/>
+        </w:rPr>
+        <w:t xml:space="preserve"> Thank you, everyone. Take care... and see you next time!</w:t>
+      </w:r>
+    </w:p>
+    <w:p>
+      <w:pPr>
+        <w:spacing w:after="120" w:lineRule="auto"/>
+        <w:rPr/>
+      </w:pPr>
+      <w:r>
+        <w:rPr>
+          <w:b w:val="1"/>
+          <w:bCs w:val="1"/>
+          <w:rtl w:val="0"/>
+        </w:rPr>
+        <w:t xml:space="preserve">ANNA:</w:t>
+      </w:r>
+      <w:r>
+        <w:rPr>
+          <w:rtl w:val="0"/>
+        </w:rPr>
+        <w:t xml:space="preserve"> Thank you so much for listening.</w:t>
       </w:r>
     </w:p>
     <w:p>
@@ -45218,7 +45210,7 @@
         <w:rPr>
           <w:rtl w:val="0"/>
         </w:rPr>
-        <w:t xml:space="preserve"> Hello, and welcome back! It's wonderful to have you with us today.</w:t>
+        <w:t xml:space="preserve"> Hello, and welcome! It's really nice to have you with us today.</w:t>
       </w:r>
     </w:p>
     <w:p>
@@ -46234,47 +46226,47 @@
         <w:rPr>
           <w:rtl w:val="0"/>
         </w:rPr>
-        <w:t xml:space="preserve">. Thank you so much for listening today.</w:t>
-      </w:r>
-    </w:p>
-    <w:p>
-      <w:pPr>
-        <w:spacing w:after="120" w:lineRule="auto"/>
-        <w:rPr/>
-      </w:pPr>
-      <w:r>
-        <w:rPr>
-          <w:b w:val="1"/>
-          <w:bCs w:val="1"/>
-          <w:rtl w:val="0"/>
-        </w:rPr>
-        <w:t xml:space="preserve">TOM:</w:t>
-      </w:r>
-      <w:r>
-        <w:rPr>
-          <w:rtl w:val="0"/>
-        </w:rPr>
-        <w:t xml:space="preserve"> Take care, go and discover something, and see you in the next episode. Äddi!</w:t>
-      </w:r>
-    </w:p>
-    <w:p>
-      <w:pPr>
-        <w:spacing w:after="120" w:lineRule="auto"/>
-        <w:rPr/>
-      </w:pPr>
-      <w:r>
-        <w:rPr>
-          <w:b w:val="1"/>
-          <w:bCs w:val="1"/>
-          <w:rtl w:val="0"/>
-        </w:rPr>
-        <w:t xml:space="preserve">ANNA:</w:t>
-      </w:r>
-      <w:r>
-        <w:rPr>
-          <w:rtl w:val="0"/>
-        </w:rPr>
-        <w:t xml:space="preserve"> Äddi!</w:t>
+        <w:t xml:space="preserve">.</w:t>
+      </w:r>
+    </w:p>
+    <w:p>
+      <w:pPr>
+        <w:spacing w:after="120" w:lineRule="auto"/>
+        <w:rPr/>
+      </w:pPr>
+      <w:r>
+        <w:rPr>
+          <w:b w:val="1"/>
+          <w:bCs w:val="1"/>
+          <w:rtl w:val="0"/>
+        </w:rPr>
+        <w:t xml:space="preserve">TOM:</w:t>
+      </w:r>
+      <w:r>
+        <w:rPr>
+          <w:rtl w:val="0"/>
+        </w:rPr>
+        <w:t xml:space="preserve"> Thank you, everyone. Take care... and see you next time!</w:t>
+      </w:r>
+    </w:p>
+    <w:p>
+      <w:pPr>
+        <w:spacing w:after="120" w:lineRule="auto"/>
+        <w:rPr/>
+      </w:pPr>
+      <w:r>
+        <w:rPr>
+          <w:b w:val="1"/>
+          <w:bCs w:val="1"/>
+          <w:rtl w:val="0"/>
+        </w:rPr>
+        <w:t xml:space="preserve">ANNA:</w:t>
+      </w:r>
+      <w:r>
+        <w:rPr>
+          <w:rtl w:val="0"/>
+        </w:rPr>
+        <w:t xml:space="preserve"> Thank you so much for listening.</w:t>
       </w:r>
     </w:p>
     <w:p>
@@ -46359,7 +46351,7 @@
         <w:rPr>
           <w:rtl w:val="0"/>
         </w:rPr>
-        <w:t xml:space="preserve"> Hello, and welcome back! It's good to have you with us today.</w:t>
+        <w:t xml:space="preserve"> Hello, and welcome! It's really nice to have you with us today.</w:t>
       </w:r>
     </w:p>
     <w:p>
@@ -47335,47 +47327,47 @@
         <w:rPr>
           <w:rtl w:val="0"/>
         </w:rPr>
-        <w:t xml:space="preserve">. Thank you so much for listening today. This was a sensitive topic, so please be gentle with yourself.</w:t>
-      </w:r>
-    </w:p>
-    <w:p>
-      <w:pPr>
-        <w:spacing w:after="120" w:lineRule="auto"/>
-        <w:rPr/>
-      </w:pPr>
-      <w:r>
-        <w:rPr>
-          <w:b w:val="1"/>
-          <w:bCs w:val="1"/>
-          <w:rtl w:val="0"/>
-        </w:rPr>
-        <w:t xml:space="preserve">TOM:</w:t>
-      </w:r>
-      <w:r>
-        <w:rPr>
-          <w:rtl w:val="0"/>
-        </w:rPr>
-        <w:t xml:space="preserve"> And if you or someone you love is affected, reaching out for help is always okay. Take care. Äddi!</w:t>
-      </w:r>
-    </w:p>
-    <w:p>
-      <w:pPr>
-        <w:spacing w:after="120" w:lineRule="auto"/>
-        <w:rPr/>
-      </w:pPr>
-      <w:r>
-        <w:rPr>
-          <w:b w:val="1"/>
-          <w:bCs w:val="1"/>
-          <w:rtl w:val="0"/>
-        </w:rPr>
-        <w:t xml:space="preserve">ANNA:</w:t>
-      </w:r>
-      <w:r>
-        <w:rPr>
-          <w:rtl w:val="0"/>
-        </w:rPr>
-        <w:t xml:space="preserve"> Äddi!</w:t>
+        <w:t xml:space="preserve">.</w:t>
+      </w:r>
+    </w:p>
+    <w:p>
+      <w:pPr>
+        <w:spacing w:after="120" w:lineRule="auto"/>
+        <w:rPr/>
+      </w:pPr>
+      <w:r>
+        <w:rPr>
+          <w:b w:val="1"/>
+          <w:bCs w:val="1"/>
+          <w:rtl w:val="0"/>
+        </w:rPr>
+        <w:t xml:space="preserve">TOM:</w:t>
+      </w:r>
+      <w:r>
+        <w:rPr>
+          <w:rtl w:val="0"/>
+        </w:rPr>
+        <w:t xml:space="preserve"> Thank you, everyone. Take care... and see you next time!</w:t>
+      </w:r>
+    </w:p>
+    <w:p>
+      <w:pPr>
+        <w:spacing w:after="120" w:lineRule="auto"/>
+        <w:rPr/>
+      </w:pPr>
+      <w:r>
+        <w:rPr>
+          <w:b w:val="1"/>
+          <w:bCs w:val="1"/>
+          <w:rtl w:val="0"/>
+        </w:rPr>
+        <w:t xml:space="preserve">ANNA:</w:t>
+      </w:r>
+      <w:r>
+        <w:rPr>
+          <w:rtl w:val="0"/>
+        </w:rPr>
+        <w:t xml:space="preserve"> Thank you so much for listening.</w:t>
       </w:r>
     </w:p>
     <w:p>
@@ -47460,7 +47452,7 @@
         <w:rPr>
           <w:rtl w:val="0"/>
         </w:rPr>
-        <w:t xml:space="preserve"> Hello, and welcome back! It's lovely to have you with us today.</w:t>
+        <w:t xml:space="preserve"> Hello, and welcome! It's really nice to have you with us today.</w:t>
       </w:r>
     </w:p>
     <w:p>
@@ -48394,7 +48386,7 @@
           <w:bCs w:val="1"/>
           <w:rtl w:val="0"/>
         </w:rPr>
-        <w:t xml:space="preserve">TOM:</w:t>
+        <w:t xml:space="preserve">ANNA:</w:t>
       </w:r>
       <w:r>
         <w:rPr>
@@ -48416,47 +48408,47 @@
         <w:rPr>
           <w:rtl w:val="0"/>
         </w:rPr>
-        <w:t xml:space="preserve">. Thank you so much for listening today.</w:t>
-      </w:r>
-    </w:p>
-    <w:p>
-      <w:pPr>
-        <w:spacing w:after="120" w:lineRule="auto"/>
-        <w:rPr/>
-      </w:pPr>
-      <w:r>
-        <w:rPr>
-          <w:b w:val="1"/>
-          <w:bCs w:val="1"/>
-          <w:rtl w:val="0"/>
-        </w:rPr>
-        <w:t xml:space="preserve">ANNA:</w:t>
-      </w:r>
-      <w:r>
-        <w:rPr>
-          <w:rtl w:val="0"/>
-        </w:rPr>
-        <w:t xml:space="preserve"> Take care, and see you in the next episode. Äddi!</w:t>
-      </w:r>
-    </w:p>
-    <w:p>
-      <w:pPr>
-        <w:spacing w:after="120" w:lineRule="auto"/>
-        <w:rPr/>
-      </w:pPr>
-      <w:r>
-        <w:rPr>
-          <w:b w:val="1"/>
-          <w:bCs w:val="1"/>
-          <w:rtl w:val="0"/>
-        </w:rPr>
-        <w:t xml:space="preserve">TOM:</w:t>
-      </w:r>
-      <w:r>
-        <w:rPr>
-          <w:rtl w:val="0"/>
-        </w:rPr>
-        <w:t xml:space="preserve"> Äddi!</w:t>
+        <w:t xml:space="preserve">.</w:t>
+      </w:r>
+    </w:p>
+    <w:p>
+      <w:pPr>
+        <w:spacing w:after="120" w:lineRule="auto"/>
+        <w:rPr/>
+      </w:pPr>
+      <w:r>
+        <w:rPr>
+          <w:b w:val="1"/>
+          <w:bCs w:val="1"/>
+          <w:rtl w:val="0"/>
+        </w:rPr>
+        <w:t xml:space="preserve">TOM:</w:t>
+      </w:r>
+      <w:r>
+        <w:rPr>
+          <w:rtl w:val="0"/>
+        </w:rPr>
+        <w:t xml:space="preserve"> Thank you, everyone. Take care... and see you next time!</w:t>
+      </w:r>
+    </w:p>
+    <w:p>
+      <w:pPr>
+        <w:spacing w:after="120" w:lineRule="auto"/>
+        <w:rPr/>
+      </w:pPr>
+      <w:r>
+        <w:rPr>
+          <w:b w:val="1"/>
+          <w:bCs w:val="1"/>
+          <w:rtl w:val="0"/>
+        </w:rPr>
+        <w:t xml:space="preserve">ANNA:</w:t>
+      </w:r>
+      <w:r>
+        <w:rPr>
+          <w:rtl w:val="0"/>
+        </w:rPr>
+        <w:t xml:space="preserve"> Thank you so much for listening.</w:t>
       </w:r>
     </w:p>
     <w:p>
@@ -48541,7 +48533,7 @@
         <w:rPr>
           <w:rtl w:val="0"/>
         </w:rPr>
-        <w:t xml:space="preserve"> Hello, and welcome back! It's a pleasure to have you with us today.</w:t>
+        <w:t xml:space="preserve"> Hello, and welcome! It's really nice to have you with us today.</w:t>
       </w:r>
     </w:p>
     <w:p>
@@ -49517,47 +49509,47 @@
         <w:rPr>
           <w:rtl w:val="0"/>
         </w:rPr>
-        <w:t xml:space="preserve">. Thank you so much for listening today.</w:t>
-      </w:r>
-    </w:p>
-    <w:p>
-      <w:pPr>
-        <w:spacing w:after="120" w:lineRule="auto"/>
-        <w:rPr/>
-      </w:pPr>
-      <w:r>
-        <w:rPr>
-          <w:b w:val="1"/>
-          <w:bCs w:val="1"/>
-          <w:rtl w:val="0"/>
-        </w:rPr>
-        <w:t xml:space="preserve">TOM:</w:t>
-      </w:r>
-      <w:r>
-        <w:rPr>
-          <w:rtl w:val="0"/>
-        </w:rPr>
-        <w:t xml:space="preserve"> Take care, stay curious, and see you in the next episode. Äddi!</w:t>
-      </w:r>
-    </w:p>
-    <w:p>
-      <w:pPr>
-        <w:spacing w:after="120" w:lineRule="auto"/>
-        <w:rPr/>
-      </w:pPr>
-      <w:r>
-        <w:rPr>
-          <w:b w:val="1"/>
-          <w:bCs w:val="1"/>
-          <w:rtl w:val="0"/>
-        </w:rPr>
-        <w:t xml:space="preserve">ANNA:</w:t>
-      </w:r>
-      <w:r>
-        <w:rPr>
-          <w:rtl w:val="0"/>
-        </w:rPr>
-        <w:t xml:space="preserve"> Äddi!</w:t>
+        <w:t xml:space="preserve">.</w:t>
+      </w:r>
+    </w:p>
+    <w:p>
+      <w:pPr>
+        <w:spacing w:after="120" w:lineRule="auto"/>
+        <w:rPr/>
+      </w:pPr>
+      <w:r>
+        <w:rPr>
+          <w:b w:val="1"/>
+          <w:bCs w:val="1"/>
+          <w:rtl w:val="0"/>
+        </w:rPr>
+        <w:t xml:space="preserve">TOM:</w:t>
+      </w:r>
+      <w:r>
+        <w:rPr>
+          <w:rtl w:val="0"/>
+        </w:rPr>
+        <w:t xml:space="preserve"> Thank you, everyone. Take care... and see you next time!</w:t>
+      </w:r>
+    </w:p>
+    <w:p>
+      <w:pPr>
+        <w:spacing w:after="120" w:lineRule="auto"/>
+        <w:rPr/>
+      </w:pPr>
+      <w:r>
+        <w:rPr>
+          <w:b w:val="1"/>
+          <w:bCs w:val="1"/>
+          <w:rtl w:val="0"/>
+        </w:rPr>
+        <w:t xml:space="preserve">ANNA:</w:t>
+      </w:r>
+      <w:r>
+        <w:rPr>
+          <w:rtl w:val="0"/>
+        </w:rPr>
+        <w:t xml:space="preserve"> Thank you so much for listening.</w:t>
       </w:r>
     </w:p>
     <w:p>
@@ -49642,7 +49634,7 @@
         <w:rPr>
           <w:rtl w:val="0"/>
         </w:rPr>
-        <w:t xml:space="preserve"> Hello, and welcome back! It's good to have you with us today.</w:t>
+        <w:t xml:space="preserve"> Hello, and welcome! It's really nice to have you with us today.</w:t>
       </w:r>
     </w:p>
     <w:p>
@@ -50576,7 +50568,7 @@
           <w:bCs w:val="1"/>
           <w:rtl w:val="0"/>
         </w:rPr>
-        <w:t xml:space="preserve">TOM:</w:t>
+        <w:t xml:space="preserve">ANNA:</w:t>
       </w:r>
       <w:r>
         <w:rPr>
@@ -50598,47 +50590,47 @@
         <w:rPr>
           <w:rtl w:val="0"/>
         </w:rPr>
-        <w:t xml:space="preserve">. Thank you so much for listening today.</w:t>
-      </w:r>
-    </w:p>
-    <w:p>
-      <w:pPr>
-        <w:spacing w:after="120" w:lineRule="auto"/>
-        <w:rPr/>
-      </w:pPr>
-      <w:r>
-        <w:rPr>
-          <w:b w:val="1"/>
-          <w:bCs w:val="1"/>
-          <w:rtl w:val="0"/>
-        </w:rPr>
-        <w:t xml:space="preserve">ANNA:</w:t>
-      </w:r>
-      <w:r>
-        <w:rPr>
-          <w:rtl w:val="0"/>
-        </w:rPr>
-        <w:t xml:space="preserve"> Take care, and see you in the next episode. Äddi!</w:t>
-      </w:r>
-    </w:p>
-    <w:p>
-      <w:pPr>
-        <w:spacing w:after="120" w:lineRule="auto"/>
-        <w:rPr/>
-      </w:pPr>
-      <w:r>
-        <w:rPr>
-          <w:b w:val="1"/>
-          <w:bCs w:val="1"/>
-          <w:rtl w:val="0"/>
-        </w:rPr>
-        <w:t xml:space="preserve">TOM:</w:t>
-      </w:r>
-      <w:r>
-        <w:rPr>
-          <w:rtl w:val="0"/>
-        </w:rPr>
-        <w:t xml:space="preserve"> Äddi!</w:t>
+        <w:t xml:space="preserve">.</w:t>
+      </w:r>
+    </w:p>
+    <w:p>
+      <w:pPr>
+        <w:spacing w:after="120" w:lineRule="auto"/>
+        <w:rPr/>
+      </w:pPr>
+      <w:r>
+        <w:rPr>
+          <w:b w:val="1"/>
+          <w:bCs w:val="1"/>
+          <w:rtl w:val="0"/>
+        </w:rPr>
+        <w:t xml:space="preserve">TOM:</w:t>
+      </w:r>
+      <w:r>
+        <w:rPr>
+          <w:rtl w:val="0"/>
+        </w:rPr>
+        <w:t xml:space="preserve"> Thank you, everyone. Take care... and see you next time!</w:t>
+      </w:r>
+    </w:p>
+    <w:p>
+      <w:pPr>
+        <w:spacing w:after="120" w:lineRule="auto"/>
+        <w:rPr/>
+      </w:pPr>
+      <w:r>
+        <w:rPr>
+          <w:b w:val="1"/>
+          <w:bCs w:val="1"/>
+          <w:rtl w:val="0"/>
+        </w:rPr>
+        <w:t xml:space="preserve">ANNA:</w:t>
+      </w:r>
+      <w:r>
+        <w:rPr>
+          <w:rtl w:val="0"/>
+        </w:rPr>
+        <w:t xml:space="preserve"> Thank you so much for listening.</w:t>
       </w:r>
     </w:p>
     <w:p>
@@ -50723,7 +50715,7 @@
         <w:rPr>
           <w:rtl w:val="0"/>
         </w:rPr>
-        <w:t xml:space="preserve"> Hello, and welcome back! It's wonderful to have you with us today.</w:t>
+        <w:t xml:space="preserve"> Hello, and welcome! It's really nice to have you with us today.</w:t>
       </w:r>
     </w:p>
     <w:p>
@@ -51697,7 +51689,7 @@
           <w:bCs w:val="1"/>
           <w:rtl w:val="0"/>
         </w:rPr>
-        <w:t xml:space="preserve">TOM:</w:t>
+        <w:t xml:space="preserve">ANNA:</w:t>
       </w:r>
       <w:r>
         <w:rPr>
@@ -51719,47 +51711,47 @@
         <w:rPr>
           <w:rtl w:val="0"/>
         </w:rPr>
-        <w:t xml:space="preserve">. Thank you so much for listening today.</w:t>
-      </w:r>
-    </w:p>
-    <w:p>
-      <w:pPr>
-        <w:spacing w:after="120" w:lineRule="auto"/>
-        <w:rPr/>
-      </w:pPr>
-      <w:r>
-        <w:rPr>
-          <w:b w:val="1"/>
-          <w:bCs w:val="1"/>
-          <w:rtl w:val="0"/>
-        </w:rPr>
-        <w:t xml:space="preserve">ANNA:</w:t>
-      </w:r>
-      <w:r>
-        <w:rPr>
-          <w:rtl w:val="0"/>
-        </w:rPr>
-        <w:t xml:space="preserve"> Take care, keep looking up, and see you in the next episode. Äddi!</w:t>
-      </w:r>
-    </w:p>
-    <w:p>
-      <w:pPr>
-        <w:spacing w:after="120" w:lineRule="auto"/>
-        <w:rPr/>
-      </w:pPr>
-      <w:r>
-        <w:rPr>
-          <w:b w:val="1"/>
-          <w:bCs w:val="1"/>
-          <w:rtl w:val="0"/>
-        </w:rPr>
-        <w:t xml:space="preserve">TOM:</w:t>
-      </w:r>
-      <w:r>
-        <w:rPr>
-          <w:rtl w:val="0"/>
-        </w:rPr>
-        <w:t xml:space="preserve"> Äddi!</w:t>
+        <w:t xml:space="preserve">.</w:t>
+      </w:r>
+    </w:p>
+    <w:p>
+      <w:pPr>
+        <w:spacing w:after="120" w:lineRule="auto"/>
+        <w:rPr/>
+      </w:pPr>
+      <w:r>
+        <w:rPr>
+          <w:b w:val="1"/>
+          <w:bCs w:val="1"/>
+          <w:rtl w:val="0"/>
+        </w:rPr>
+        <w:t xml:space="preserve">TOM:</w:t>
+      </w:r>
+      <w:r>
+        <w:rPr>
+          <w:rtl w:val="0"/>
+        </w:rPr>
+        <w:t xml:space="preserve"> Thank you, everyone. Take care... and see you next time!</w:t>
+      </w:r>
+    </w:p>
+    <w:p>
+      <w:pPr>
+        <w:spacing w:after="120" w:lineRule="auto"/>
+        <w:rPr/>
+      </w:pPr>
+      <w:r>
+        <w:rPr>
+          <w:b w:val="1"/>
+          <w:bCs w:val="1"/>
+          <w:rtl w:val="0"/>
+        </w:rPr>
+        <w:t xml:space="preserve">ANNA:</w:t>
+      </w:r>
+      <w:r>
+        <w:rPr>
+          <w:rtl w:val="0"/>
+        </w:rPr>
+        <w:t xml:space="preserve"> Thank you so much for listening.</w:t>
       </w:r>
     </w:p>
     <w:p>
@@ -51844,7 +51836,7 @@
         <w:rPr>
           <w:rtl w:val="0"/>
         </w:rPr>
-        <w:t xml:space="preserve"> Hello, and welcome back! It's lovely to have you with us today.</w:t>
+        <w:t xml:space="preserve"> Hello, and welcome! It's really nice to have you with us today.</w:t>
       </w:r>
     </w:p>
     <w:p>
@@ -53738,7 +53730,7 @@
           <w:bCs w:val="1"/>
           <w:rtl w:val="0"/>
         </w:rPr>
-        <w:t xml:space="preserve">TOM:</w:t>
+        <w:t xml:space="preserve">ANNA:</w:t>
       </w:r>
       <w:r>
         <w:rPr>
@@ -53760,47 +53752,47 @@
         <w:rPr>
           <w:rtl w:val="0"/>
         </w:rPr>
-        <w:t xml:space="preserve">. Thank you so much for listening today.</w:t>
-      </w:r>
-    </w:p>
-    <w:p>
-      <w:pPr>
-        <w:spacing w:after="120" w:lineRule="auto"/>
-        <w:rPr/>
-      </w:pPr>
-      <w:r>
-        <w:rPr>
-          <w:b w:val="1"/>
-          <w:bCs w:val="1"/>
-          <w:rtl w:val="0"/>
-        </w:rPr>
-        <w:t xml:space="preserve">ANNA:</w:t>
-      </w:r>
-      <w:r>
-        <w:rPr>
-          <w:rtl w:val="0"/>
-        </w:rPr>
-        <w:t xml:space="preserve"> Take care, keep learning, and see you in the next episode. Äddi!</w:t>
-      </w:r>
-    </w:p>
-    <w:p>
-      <w:pPr>
-        <w:spacing w:after="120" w:lineRule="auto"/>
-        <w:rPr/>
-      </w:pPr>
-      <w:r>
-        <w:rPr>
-          <w:b w:val="1"/>
-          <w:bCs w:val="1"/>
-          <w:rtl w:val="0"/>
-        </w:rPr>
-        <w:t xml:space="preserve">TOM:</w:t>
-      </w:r>
-      <w:r>
-        <w:rPr>
-          <w:rtl w:val="0"/>
-        </w:rPr>
-        <w:t xml:space="preserve"> Äddi!</w:t>
+        <w:t xml:space="preserve">.</w:t>
+      </w:r>
+    </w:p>
+    <w:p>
+      <w:pPr>
+        <w:spacing w:after="120" w:lineRule="auto"/>
+        <w:rPr/>
+      </w:pPr>
+      <w:r>
+        <w:rPr>
+          <w:b w:val="1"/>
+          <w:bCs w:val="1"/>
+          <w:rtl w:val="0"/>
+        </w:rPr>
+        <w:t xml:space="preserve">TOM:</w:t>
+      </w:r>
+      <w:r>
+        <w:rPr>
+          <w:rtl w:val="0"/>
+        </w:rPr>
+        <w:t xml:space="preserve"> Thank you, everyone. Take care... and see you next time!</w:t>
+      </w:r>
+    </w:p>
+    <w:p>
+      <w:pPr>
+        <w:spacing w:after="120" w:lineRule="auto"/>
+        <w:rPr/>
+      </w:pPr>
+      <w:r>
+        <w:rPr>
+          <w:b w:val="1"/>
+          <w:bCs w:val="1"/>
+          <w:rtl w:val="0"/>
+        </w:rPr>
+        <w:t xml:space="preserve">ANNA:</w:t>
+      </w:r>
+      <w:r>
+        <w:rPr>
+          <w:rtl w:val="0"/>
+        </w:rPr>
+        <w:t xml:space="preserve"> Thank you so much for listening.</w:t>
       </w:r>
     </w:p>
     <w:p>

</xml_diff>

<commit_message>
Fact-check update episodes 1-13: scripts (EN/FR/DE/LB), quizzes, Word doc
</commit_message>
<xml_diff>
--- a/Biergerpakt_Podcast_Scripts_All_Episodes_EN_2026-09-30.docx
+++ b/Biergerpakt_Podcast_Scripts_All_Episodes_EN_2026-09-30.docx
@@ -245,7 +245,7 @@
         <w:rPr>
           <w:rtl w:val="0"/>
         </w:rPr>
-        <w:t xml:space="preserve"> Okay, so... MyGuichet.lu is the information portal that simplifies your interactions with the State. It gives you quick, user-friendly access to all the information, procedures and services offered by Luxembourg's public administrations and bodies. It's secure, and it's your... let's say, your single point of contact with the public administrations. So instead of going to an office, you can do many administrative procedures from home. On your computer, or on your phone.</w:t>
+        <w:t xml:space="preserve"> Okay, so... Guichet.lu is the State's information website, and MyGuichet.lu is its secure online space. Together they give you quick, user-friendly access to all the information, procedures and services offered by Luxembourg's public administrations and bodies. MyGuichet.lu is secure, and it's your... let's say, your single point of contact with the public administrations. So instead of going to an office, you can do many administrative procedures from home. On your computer, or on your phone.</w:t>
       </w:r>
     </w:p>
     <w:p>
@@ -565,7 +565,7 @@
         <w:rPr>
           <w:rtl w:val="0"/>
         </w:rPr>
-        <w:t xml:space="preserve"> Yes, if you work in Luxembourg, you have one. It's on your social security card, for example. Then you need an email address, a computer or a smartphone... and one more thing. A way to prove your identity online. </w:t>
+        <w:t xml:space="preserve"> Yes, if you work in Luxembourg, you have one. It's on your social security card, for example. Then you need an email address, and a computer — for the first registration, a laptop or desktop, not your phone. And one more thing: a way to prove your identity online. </w:t>
       </w:r>
     </w:p>
     <w:p>
@@ -699,7 +699,7 @@
         <w:rPr>
           <w:rtl w:val="0"/>
         </w:rPr>
-        <w:t xml:space="preserve"> Exactly. If your country has one of these national systems, you can often use it to log in to MyGuichet. And one more thing — some simple procedures work even </w:t>
+        <w:t xml:space="preserve"> Exactly. If your country has one of these national systems, you can often use it to log in to MyGuichet — you still need your matricule. But with a foreign login, you can't sign some forms, like your tax return. And one more thing — some simple procedures work even without logging in at all. But then you have fewer options. You can't save the form and continue later, and you can't follow the status. So... having a real account is much better.</w:t>
       </w:r>
       <w:r>
         <w:rPr>
@@ -707,13 +707,13 @@
           <w:iCs w:val="1"/>
           <w:rtl w:val="0"/>
         </w:rPr>
-        <w:t xml:space="preserve">without</w:t>
-      </w:r>
-      <w:r>
-        <w:rPr>
-          <w:rtl w:val="0"/>
-        </w:rPr>
-        <w:t xml:space="preserve"> logging in at all. But then you have fewer options. You can't save the form and continue later, and you can't follow the status. So... having a real account is much better.</w:t>
+        <w:t xml:space="preserve"/>
+      </w:r>
+      <w:r>
+        <w:rPr>
+          <w:rtl w:val="0"/>
+        </w:rPr>
+        <w:t xml:space="preserve"/>
       </w:r>
     </w:p>
     <w:p>
@@ -813,7 +813,7 @@
         <w:rPr>
           <w:rtl w:val="0"/>
         </w:rPr>
-        <w:t xml:space="preserve"> Almost everything in daily life, really. Let's see... citizenship — so identity card, passport, criminal record. And here is a nice one: as a foreign resident, you can apply to register on the electoral rolls — so you can vote in the communal elections, and in the European elections. Then immigration — residence permits, for example. Very important when you arrive. Then family and education... taxation — yes, you can do your tax return online. Transport — your driving licence, registering a car. Health and social security. Housing. Financial aid. Work and pension... and even leisure, like registration at the National Library.</w:t>
+        <w:t xml:space="preserve"> Almost everything in daily life, really. Let's see... citizenship — so identity card, passport, criminal record. And here is a nice one: as a foreign resident, you can apply to register on the electoral rolls — so you can vote in the communal elections. And if you're a citizen of another EU country, in the European elections too. Then immigration — residence permits, for example. Very important when you arrive. Then family and education... taxation — yes, you can do your tax return online. Transport — your driving licence, registering a car. Health and social security. Housing. Financial aid. Work and pension... and even leisure, like registration at the National Library.</w:t>
       </w:r>
     </w:p>
     <w:p>
@@ -2070,7 +2070,7 @@
         <w:rPr>
           <w:rtl w:val="0"/>
         </w:rPr>
-        <w:t xml:space="preserve"> Almost. One small thing to remember — after activation, the certificate becomes usable after about four hours. So don't activate it five minutes before you need it. Do it a little in advance.</w:t>
+        <w:t xml:space="preserve"> Almost. One small thing to remember — if you have the SmartCard, the certificate becomes usable only about four hours after activation. So don't activate it five minutes before you need it. Do it a little in advance.</w:t>
       </w:r>
     </w:p>
     <w:p>
@@ -2190,7 +2190,7 @@
         <w:rPr>
           <w:rtl w:val="0"/>
         </w:rPr>
-        <w:t xml:space="preserve"> Even then. And more — LuxTrust will never call you to ask for sensitive information. They will never ask for access to your computer or your phone. And they will never come to your home.</w:t>
+        <w:t xml:space="preserve"> Even then. And more — LuxTrust will never call you to ask for sensitive information. They will never ask you to confirm a payment or a banking operation. And they will never come to your home.</w:t>
       </w:r>
     </w:p>
     <w:p>
@@ -2988,7 +2988,7 @@
         <w:rPr>
           <w:rtl w:val="0"/>
         </w:rPr>
-        <w:t xml:space="preserve"> Yes — lots of them. On benevolat.lu, many missions are just for a single event, or a single day. Real examples on the site right now: helping at a gymnastics gala for one weekend. Being a marshal for one day at a cycling race. Manning the barbecue at a summer party. Making Christmas decorations. </w:t>
+        <w:t xml:space="preserve"> Yes — lots of them. On benevolat.lu, many missions are just for a single event, or a single day. For example: helping at a sports gala for one weekend. Being a marshal for one day at a cycling race. Helping at a summer party. Or making Christmas decorations. </w:t>
       </w:r>
     </w:p>
     <w:p>
@@ -4780,7 +4780,7 @@
         <w:rPr>
           <w:rtl w:val="0"/>
         </w:rPr>
-        <w:t xml:space="preserve"> The main ones are these. Your household receives the cost-of-living allowance. Or you're a refugee — an asylum seeker, a person under temporary protection, or an unaccompanied minor. Or you hold a residence permit of the "private life" type. Or you're going through an official debt-settlement procedure for over-indebtedness.</w:t>
+        <w:t xml:space="preserve"> The main ones are these. Your household receives the cost-of-living allowance. Or you're a refugee — an asylum seeker, a person under temporary protection, or an unaccompanied minor. There are a few other cases too, so check the website to see if you qualify.</w:t>
       </w:r>
     </w:p>
     <w:p>
@@ -4820,87 +4820,87 @@
         <w:rPr>
           <w:rtl w:val="0"/>
         </w:rPr>
-        <w:t xml:space="preserve"> Exactly — the people for whom buying a computer would be a real struggle. And here's some good recent news. In the past, it was one computer per household. But since late 2025, because they've received so many donations, each member of the household aged twelve or older can get their own computer.</w:t>
-      </w:r>
-    </w:p>
-    <w:p>
-      <w:pPr>
-        <w:spacing w:after="120" w:lineRule="auto"/>
-        <w:rPr/>
-      </w:pPr>
-      <w:r>
-        <w:rPr>
-          <w:b w:val="1"/>
-          <w:bCs w:val="1"/>
-          <w:rtl w:val="0"/>
-        </w:rPr>
-        <w:t xml:space="preserve">ANNA:</w:t>
-      </w:r>
-      <w:r>
-        <w:rPr>
-          <w:rtl w:val="0"/>
-        </w:rPr>
-        <w:t xml:space="preserve"> So now the teenager doing homework, and the parent looking for work, can each have their own machine.</w:t>
-      </w:r>
-    </w:p>
-    <w:p>
-      <w:pPr>
-        <w:spacing w:after="120" w:lineRule="auto"/>
-        <w:rPr/>
-      </w:pPr>
-      <w:r>
-        <w:rPr>
-          <w:b w:val="1"/>
-          <w:bCs w:val="1"/>
-          <w:rtl w:val="0"/>
-        </w:rPr>
-        <w:t xml:space="preserve">TOM:</w:t>
-      </w:r>
-      <w:r>
-        <w:rPr>
-          <w:rtl w:val="0"/>
-        </w:rPr>
-        <w:t xml:space="preserve"> Each their own. Adults apply for themselves, and an adult can apply for the children, aged twelve to eighteen, in their home. And the waiting time, right now, is usually under a month.</w:t>
-      </w:r>
-    </w:p>
-    <w:p>
-      <w:pPr>
-        <w:spacing w:after="120" w:lineRule="auto"/>
-        <w:rPr/>
-      </w:pPr>
-      <w:r>
-        <w:rPr>
-          <w:b w:val="1"/>
-          <w:bCs w:val="1"/>
-          <w:rtl w:val="0"/>
-        </w:rPr>
-        <w:t xml:space="preserve">ANNA:</w:t>
-      </w:r>
-      <w:r>
-        <w:rPr>
-          <w:rtl w:val="0"/>
-        </w:rPr>
-        <w:t xml:space="preserve"> Under a month — that's fast. And what kind of computer do you actually get? Some old, broken thing?</w:t>
-      </w:r>
-    </w:p>
-    <w:p>
-      <w:pPr>
-        <w:spacing w:after="120" w:lineRule="auto"/>
-        <w:rPr/>
-      </w:pPr>
-      <w:r>
-        <w:rPr>
-          <w:b w:val="1"/>
-          <w:bCs w:val="1"/>
-          <w:rtl w:val="0"/>
-        </w:rPr>
-        <w:t xml:space="preserve">TOM:</w:t>
-      </w:r>
-      <w:r>
-        <w:rPr>
-          <w:rtl w:val="0"/>
-        </w:rPr>
-        <w:t xml:space="preserve"> No, that's the lovely part. They come ready to use, with the operating system already installed — Windows, or a Mac, or sometimes Linux. A decent processor. And they even come with a free repair warranty — apart from the battery, which on an old laptop might be weak or missing.</w:t>
+        <w:t xml:space="preserve"> Exactly — the people for whom buying a computer would be a real struggle. Usually, it's one laptop per household. But other members of the family can often ask for an extra computer too.</w:t>
+      </w:r>
+    </w:p>
+    <w:p>
+      <w:pPr>
+        <w:spacing w:after="120" w:lineRule="auto"/>
+        <w:rPr/>
+      </w:pPr>
+      <w:r>
+        <w:rPr>
+          <w:b w:val="1"/>
+          <w:bCs w:val="1"/>
+          <w:rtl w:val="0"/>
+        </w:rPr>
+        <w:t xml:space="preserve">ANNA:</w:t>
+      </w:r>
+      <w:r>
+        <w:rPr>
+          <w:rtl w:val="0"/>
+        </w:rPr>
+        <w:t xml:space="preserve"> So the teenager doing homework, and the parent looking for work, may each get a machine?</w:t>
+      </w:r>
+    </w:p>
+    <w:p>
+      <w:pPr>
+        <w:spacing w:after="120" w:lineRule="auto"/>
+        <w:rPr/>
+      </w:pPr>
+      <w:r>
+        <w:rPr>
+          <w:b w:val="1"/>
+          <w:bCs w:val="1"/>
+          <w:rtl w:val="0"/>
+        </w:rPr>
+        <w:t xml:space="preserve">TOM:</w:t>
+      </w:r>
+      <w:r>
+        <w:rPr>
+          <w:rtl w:val="0"/>
+        </w:rPr>
+        <w:t xml:space="preserve"> Often, yes. The rules change from time to time, so the website explains the latest ones — and how long you might have to wait.</w:t>
+      </w:r>
+    </w:p>
+    <w:p>
+      <w:pPr>
+        <w:spacing w:after="120" w:lineRule="auto"/>
+        <w:rPr/>
+      </w:pPr>
+      <w:r>
+        <w:rPr>
+          <w:b w:val="1"/>
+          <w:bCs w:val="1"/>
+          <w:rtl w:val="0"/>
+        </w:rPr>
+        <w:t xml:space="preserve">ANNA:</w:t>
+      </w:r>
+      <w:r>
+        <w:rPr>
+          <w:rtl w:val="0"/>
+        </w:rPr>
+        <w:t xml:space="preserve"> Good to know. And what kind of computer do you actually get? Some old, broken thing?</w:t>
+      </w:r>
+    </w:p>
+    <w:p>
+      <w:pPr>
+        <w:spacing w:after="120" w:lineRule="auto"/>
+        <w:rPr/>
+      </w:pPr>
+      <w:r>
+        <w:rPr>
+          <w:b w:val="1"/>
+          <w:bCs w:val="1"/>
+          <w:rtl w:val="0"/>
+        </w:rPr>
+        <w:t xml:space="preserve">TOM:</w:t>
+      </w:r>
+      <w:r>
+        <w:rPr>
+          <w:rtl w:val="0"/>
+        </w:rPr>
+        <w:t xml:space="preserve"> No, that's the lovely part. They come ready to use, with the operating system already installed — usually Windows, or a Mac. A decent processor. And they even come with a free repair warranty — apart from the battery, which on an old laptop might be weak or missing.</w:t>
       </w:r>
     </w:p>
     <w:p>
@@ -6186,7 +6186,7 @@
         <w:rPr>
           <w:rtl w:val="0"/>
         </w:rPr>
-        <w:t xml:space="preserve"> It's a service that gives personalised, human support. It informs you, advises you, and guides you through the administrative steps and the integration process. And if you need a specific institution, it puts you in touch with the right one.</w:t>
+        <w:t xml:space="preserve"> It's a service that gives personalised, human support. It informs you, advises you, and guides you through the administrative steps and the integration process. And if you need a specific institution, it puts you in touch with the right one. You can reach the Talent Desk by email, at contact@talentdesk.lu, or visit them in Kirchberg, by appointment.</w:t>
       </w:r>
     </w:p>
     <w:p>
@@ -6952,7 +6952,7 @@
         <w:rPr>
           <w:rtl w:val="0"/>
         </w:rPr>
-        <w:t xml:space="preserve"> Every person affiliated to the Luxembourg health insurance can have one. To use it yourself online, you activate your "eSanté account". And here's good news: you can activate it directly through MyGuichet.lu. </w:t>
+        <w:t xml:space="preserve"> Good news — you don't need to open it. If you're affiliated to the Luxembourg health insurance, your DSP is created automatically. To use it yourself online, you activate your "eSanté account". And you can do that directly through MyGuichet.lu.</w:t>
       </w:r>
     </w:p>
     <w:p>
@@ -7112,27 +7112,27 @@
         <w:rPr>
           <w:rtl w:val="0"/>
         </w:rPr>
-        <w:t xml:space="preserve"> Right, this is the important part. The Luxembourg system traditionally works by reimbursement. That means — for a normal visit to the doctor, you pay first, and then the CNS pays you back most of it.</w:t>
-      </w:r>
-    </w:p>
-    <w:p>
-      <w:pPr>
-        <w:spacing w:after="120" w:lineRule="auto"/>
-        <w:rPr/>
-      </w:pPr>
-      <w:r>
-        <w:rPr>
-          <w:b w:val="1"/>
-          <w:bCs w:val="1"/>
-          <w:rtl w:val="0"/>
-        </w:rPr>
-        <w:t xml:space="preserve">TOM:</w:t>
-      </w:r>
-      <w:r>
-        <w:rPr>
-          <w:rtl w:val="0"/>
-        </w:rPr>
-        <w:t xml:space="preserve"> So I pay the full price at the doctor, and then get money back later.</w:t>
+        <w:t xml:space="preserve"> Right, this is the important part. Traditionally, you pay the doctor first, and then the CNS pays you back most of it. But today, about half of doctors use "immediate direct payment". Then you only pay your own small share, and the CNS pays the doctor the rest straight away.</w:t>
+      </w:r>
+    </w:p>
+    <w:p>
+      <w:pPr>
+        <w:spacing w:after="120" w:lineRule="auto"/>
+        <w:rPr/>
+      </w:pPr>
+      <w:r>
+        <w:rPr>
+          <w:b w:val="1"/>
+          <w:bCs w:val="1"/>
+          <w:rtl w:val="0"/>
+        </w:rPr>
+        <w:t xml:space="preserve">TOM:</w:t>
+      </w:r>
+      <w:r>
+        <w:rPr>
+          <w:rtl w:val="0"/>
+        </w:rPr>
+        <w:t xml:space="preserve"> So either I pay the full price and get money back later — or, with direct payment, I only pay my share.</w:t>
       </w:r>
     </w:p>
     <w:p>
@@ -7192,7 +7192,7 @@
         <w:rPr>
           <w:rtl w:val="0"/>
         </w:rPr>
-        <w:t xml:space="preserve"> Simple. The doctor gives you an invoice — a paper bill — and you pay it. Then you send that original, paid invoice to the CNS. You can send it by post, or drop it in one of their boxes. The CNS then pays the reimbursement straight into your bank account.</w:t>
+        <w:t xml:space="preserve"> Simple. The doctor gives you an invoice — a paper bill — and you pay it. Then you send that original, paid invoice to the CNS. You can send it by post, or drop it in one of their boxes. And if your doctor gives you a digital invoice, you can send it with a few clicks — in the CNS app, the GesondheetsApp, or on MyGuichet.lu. The CNS then pays the reimbursement straight into your bank account.</w:t>
       </w:r>
     </w:p>
     <w:p>
@@ -7232,7 +7232,7 @@
         <w:rPr>
           <w:rtl w:val="0"/>
         </w:rPr>
-        <w:t xml:space="preserve"> Usually less than three weeks. And you get a written statement explaining what was reimbursed. So — tip for our listeners — give the CNS your bank account number, your IBAN, so they can pay you directly. </w:t>
+        <w:t xml:space="preserve"> For a paper bill, usually two to four weeks. With a digital bill, it can be just a few days. And you get a written statement explaining what was reimbursed. So — tip for our listeners — give the CNS your bank account number, your IBAN, so they can pay you directly. </w:t>
       </w:r>
     </w:p>
     <w:p>
@@ -7372,7 +7372,7 @@
         <w:rPr>
           <w:rtl w:val="0"/>
         </w:rPr>
-        <w:t xml:space="preserve"> That makes it much easier. So... medicines and hospital — I pay only my share. The normal doctor visit — I pay first and get reimbursed.</w:t>
+        <w:t xml:space="preserve"> That makes it much easier. So... medicines and hospital — I pay only my share. The normal doctor visit — I pay first and get reimbursed, unless my doctor uses direct payment.</w:t>
       </w:r>
     </w:p>
     <w:p>
@@ -7472,7 +7472,7 @@
         <w:rPr>
           <w:rtl w:val="0"/>
         </w:rPr>
-        <w:t xml:space="preserve"> Exactly. If that's your situation, you can ask about the social third-party payment — often through your doctor or the social office.</w:t>
+        <w:t xml:space="preserve"> Exactly. If that's your situation, you can ask for the social third-party payment at the social office — the office social — of your municipality.</w:t>
       </w:r>
     </w:p>
     <w:p>
@@ -7552,7 +7552,7 @@
         <w:rPr>
           <w:rtl w:val="0"/>
         </w:rPr>
-        <w:t xml:space="preserve"> Part two — the CNS, the national health insurance. For a normal doctor visit, you pay first and the CNS reimburses most of it into your bank account, in about three weeks. For medicines and hospital, you usually pay only your small share. And if money is tight, the social third-party payment means you don't pay up front.</w:t>
+        <w:t xml:space="preserve"> Part two — the CNS, the national health insurance. For a normal doctor visit, either your doctor uses immediate direct payment and you only pay your share — or you pay first, and the CNS reimburses most of it into your bank account, within a few weeks, or a few days for a digital bill. For medicines and hospital, you usually pay only your small share. And if money is tight, the social third-party payment means you don't pay up front.</w:t>
       </w:r>
     </w:p>
     <w:p>
@@ -8380,7 +8380,7 @@
         <w:rPr>
           <w:rtl w:val="0"/>
         </w:rPr>
-        <w:t xml:space="preserve"> ...then you don't need to do anything. The message will say clearly that it is a test. Luxembourg runs national tests. It's normal, don't worry.</w:t>
+        <w:t xml:space="preserve"> ...then you don't need to do anything. The message will say clearly that it is a test. Luxembourg tests the system every month — and the sirens are tested on the first Monday of the month, around noon. It's normal, don't worry.</w:t>
       </w:r>
     </w:p>
     <w:p>
@@ -10929,7 +10929,7 @@
         <w:rPr>
           <w:rtl w:val="0"/>
         </w:rPr>
-        <w:t xml:space="preserve"> Good question. There is a national service for information and mediation in this field. So if you need to be guided, or if there's a disagreement with a service, there's a neutral place that can help you find a solution.</w:t>
+        <w:t xml:space="preserve"> Good question. You can simply call the Senioren-Telefon, 247-86000, for information and advice. And if there's a disagreement with a service, there's SIMPA, the national information and mediation service — a neutral place that helps you find a solution.</w:t>
       </w:r>
     </w:p>
     <w:p>
@@ -11049,7 +11049,7 @@
         <w:rPr>
           <w:rtl w:val="0"/>
         </w:rPr>
-        <w:t xml:space="preserve"> Yes. Ageing isn't only about care. It's also about staying active, useful, and connected. And there's also financial support — for people who don't have enough money to cover the cost of care, the State helps.</w:t>
+        <w:t xml:space="preserve"> Yes. Ageing isn't only about care. It's also about staying active, useful, and connected. And there's also financial support. Since 2026, a scheme called COMPA helps people who don't have enough money to pay for a care home or supervised housing.</w:t>
       </w:r>
     </w:p>
     <w:p>
@@ -11955,7 +11955,7 @@
         <w:rPr>
           <w:rtl w:val="0"/>
         </w:rPr>
-        <w:t xml:space="preserve"> The infrastructure portal on accessibilite.lu has the rules, the procedures, and a toolbox. So an architect, a commune, or an owner can find what they need to do it right.</w:t>
+        <w:t xml:space="preserve"> The infrastructure portal on accessibilite.lu has the rules, the procedures, and a toolbox. So an architect, a commune, or an owner can find what they need to do it right. And there's money to help: the State can pay half the cost of the works, up to twenty-four thousand euros per place — if you apply before July 2028.</w:t>
       </w:r>
     </w:p>
     <w:p>
@@ -12115,7 +12115,7 @@
         <w:rPr>
           <w:rtl w:val="0"/>
         </w:rPr>
-        <w:t xml:space="preserve"> Yes. If you make or sell certain products and services, they have to be accessible. Now — there's an exception for the very small businesses. Roughly speaking, the rules focus on companies with more than ten employees and a certain size of turnover. So the tiny shop on the corner isn't treated the same as a big bank.</w:t>
+        <w:t xml:space="preserve"> Yes. If you make or sell certain products and services, they have to be accessible. Now — there's an exception for the very small businesses. If a company has fewer than ten employees and a turnover under two million euros, the rules for services don't apply to it. So the tiny shop on the corner isn't treated the same as a big bank.</w:t>
       </w:r>
     </w:p>
     <w:p>
@@ -12778,7 +12778,7 @@
         <w:rPr>
           <w:rtl w:val="0"/>
         </w:rPr>
-        <w:t xml:space="preserve"> It's here in Luxembourg — in Esch-sur-Alzette, in the south. On the boulevard J.F. Kennedy. It opened in 2015. It was created as a place for meeting, exchange, and communication — a single roof for all the people working on cross-border cooperation. Under that one roof, you find several teams. The main one is the Summit Secretariat of the Greater Region. There's also the secretariat of the Economic and Social Committee. There's the team that manages one of the European funding programmes, called Interreg. And there's also the cultural association, the Espace Culturel.</w:t>
+        <w:t xml:space="preserve"> It's here in Luxembourg — in Esch-sur-Alzette, in the south. On the boulevard J.F. Kennedy. It opened in 2015. It was created as a place for meeting, exchange, and communication — a single roof for all the people working on cross-border cooperation. Under that one roof, you find several teams. The main one is the Summit Secretariat of the Greater Region. There's also the secretariat of the Economic and Social Committee. There's the team that manages one of the European funding programmes, called Interreg. And there are also networks of towns and communes, like QuattroPole and EuRegio.</w:t>
       </w:r>
     </w:p>
     <w:p>
@@ -13258,47 +13258,47 @@
         <w:rPr>
           <w:rtl w:val="0"/>
         </w:rPr>
-        <w:t xml:space="preserve"> Education is a real jewel. There's the University of the Greater Region. It links six universities, in four countries, and lets students move between them.</w:t>
-      </w:r>
-    </w:p>
-    <w:p>
-      <w:pPr>
-        <w:spacing w:after="120" w:lineRule="auto"/>
-        <w:rPr/>
-      </w:pPr>
-      <w:r>
-        <w:rPr>
-          <w:b w:val="1"/>
-          <w:bCs w:val="1"/>
-          <w:rtl w:val="0"/>
-        </w:rPr>
-        <w:t xml:space="preserve">TOM:</w:t>
-      </w:r>
-      <w:r>
-        <w:rPr>
-          <w:rtl w:val="0"/>
-        </w:rPr>
-        <w:t xml:space="preserve"> Six universities working as one network.</w:t>
-      </w:r>
-    </w:p>
-    <w:p>
-      <w:pPr>
-        <w:spacing w:after="120" w:lineRule="auto"/>
-        <w:rPr/>
-      </w:pPr>
-      <w:r>
-        <w:rPr>
-          <w:b w:val="1"/>
-          <w:bCs w:val="1"/>
-          <w:rtl w:val="0"/>
-        </w:rPr>
-        <w:t xml:space="preserve">ANNA:</w:t>
-      </w:r>
-      <w:r>
-        <w:rPr>
-          <w:rtl w:val="0"/>
-        </w:rPr>
-        <w:t xml:space="preserve"> Yes. More than a hundred and thirty thousand students, with cross-border courses, double diplomas, joint degrees. So a young person can study in several countries and come out with qualifications recognised across the Region.</w:t>
+        <w:t xml:space="preserve"> Education is a real jewel. There's the University of the Greater Region. It links seven universities, in four countries, and lets students move between them.</w:t>
+      </w:r>
+    </w:p>
+    <w:p>
+      <w:pPr>
+        <w:spacing w:after="120" w:lineRule="auto"/>
+        <w:rPr/>
+      </w:pPr>
+      <w:r>
+        <w:rPr>
+          <w:b w:val="1"/>
+          <w:bCs w:val="1"/>
+          <w:rtl w:val="0"/>
+        </w:rPr>
+        <w:t xml:space="preserve">TOM:</w:t>
+      </w:r>
+      <w:r>
+        <w:rPr>
+          <w:rtl w:val="0"/>
+        </w:rPr>
+        <w:t xml:space="preserve"> Seven universities working as one network.</w:t>
+      </w:r>
+    </w:p>
+    <w:p>
+      <w:pPr>
+        <w:spacing w:after="120" w:lineRule="auto"/>
+        <w:rPr/>
+      </w:pPr>
+      <w:r>
+        <w:rPr>
+          <w:b w:val="1"/>
+          <w:bCs w:val="1"/>
+          <w:rtl w:val="0"/>
+        </w:rPr>
+        <w:t xml:space="preserve">ANNA:</w:t>
+      </w:r>
+      <w:r>
+        <w:rPr>
+          <w:rtl w:val="0"/>
+        </w:rPr>
+        <w:t xml:space="preserve"> Yes. More than a hundred and forty thousand students, with cross-border courses, double diplomas, joint degrees. So a young person can study in several countries and come out with qualifications recognised across the Region.</w:t>
       </w:r>
     </w:p>
     <w:p>
@@ -13378,27 +13378,27 @@
         <w:rPr>
           <w:rtl w:val="0"/>
         </w:rPr>
-        <w:t xml:space="preserve"> A lot of culture. Remember, back in two thousand and seven, Luxembourg and the Greater Region were together the European Capital of Culture for a whole year. That left behind a cultural association — the Espace Culturel — which is actually one of the neighbours in the House.</w:t>
-      </w:r>
-    </w:p>
-    <w:p>
-      <w:pPr>
-        <w:spacing w:after="120" w:lineRule="auto"/>
-        <w:rPr/>
-      </w:pPr>
-      <w:r>
-        <w:rPr>
-          <w:b w:val="1"/>
-          <w:bCs w:val="1"/>
-          <w:rtl w:val="0"/>
-        </w:rPr>
-        <w:t xml:space="preserve">TOM:</w:t>
-      </w:r>
-      <w:r>
-        <w:rPr>
-          <w:rtl w:val="0"/>
-        </w:rPr>
-        <w:t xml:space="preserve"> So the House isn't only about politics and paperwork — there's culture living inside it too.</w:t>
+        <w:t xml:space="preserve"> A lot of culture. Remember, back in two thousand and seven, Luxembourg and the Greater Region were together the European Capital of Culture for a whole year. That year left a real cross-border cultural spirit behind — and you can still feel it all over the Region.</w:t>
+      </w:r>
+    </w:p>
+    <w:p>
+      <w:pPr>
+        <w:spacing w:after="120" w:lineRule="auto"/>
+        <w:rPr/>
+      </w:pPr>
+      <w:r>
+        <w:rPr>
+          <w:b w:val="1"/>
+          <w:bCs w:val="1"/>
+          <w:rtl w:val="0"/>
+        </w:rPr>
+        <w:t xml:space="preserve">TOM:</w:t>
+      </w:r>
+      <w:r>
+        <w:rPr>
+          <w:rtl w:val="0"/>
+        </w:rPr>
+        <w:t xml:space="preserve"> So the Greater Region isn't only about politics and paperwork — there's real culture living in it too.</w:t>
       </w:r>
     </w:p>
     <w:p>
@@ -14049,7 +14049,7 @@
         <w:rPr>
           <w:rtl w:val="0"/>
         </w:rPr>
-        <w:t xml:space="preserve"> Then there is the second way... registering in person at an ADEM agency. For that, you first call to make an appointment. The number is the ADEM Contact Centre, on 2-4-7, 8-8-8-8-8. And ADEM has six regional agencies... in Luxembourg City, in Esch-sur-Alzette, Differdange, Wasserbillig, Wiltz and in Diekirch. You'll be offered the office closest to your home.</w:t>
+        <w:t xml:space="preserve"> Then there is the second way... registering in person at an ADEM agency. For that, you first call to make an appointment. The number is the ADEM Contact Centre, on 2-4-7, 8-8-8-8-8. ADEM has several regional agencies, but you register in person at one of three... in Luxembourg City, in Esch-Belval, or in Diekirch. You'll be offered the one closest to your home.</w:t>
       </w:r>
     </w:p>
     <w:p>
@@ -14449,7 +14449,7 @@
         <w:rPr>
           <w:rtl w:val="0"/>
         </w:rPr>
-        <w:t xml:space="preserve"> It's called the Youth Guarantee. The goal is that every young person, aged fifteen to thirty, is offered a concrete solution to enter working life.</w:t>
+        <w:t xml:space="preserve"> It's called the Youth Guarantee. The goal is that every young person, aged sixteen to thirty, is offered a concrete solution to enter working life.</w:t>
       </w:r>
     </w:p>
     <w:p>

</xml_diff>

<commit_message>
Remove the Clarvia episode (sources archived)
</commit_message>
<xml_diff>
--- a/Biergerpakt_Podcast_Scripts_All_Episodes_EN_2026-09-30.docx
+++ b/Biergerpakt_Podcast_Scripts_All_Episodes_EN_2026-09-30.docx
@@ -53682,19 +53682,6 @@
           <w:rtl w:val="0"/>
         </w:rPr>
         <w:t xml:space="preserve">Episode 41 - CNAP</w:t>
-      </w:r>
-    </w:p>
-    <w:p>
-      <w:pPr>
-        <w:pageBreakBefore w:val="1"/>
-        <w:spacing w:after="120" w:lineRule="auto"/>
-        <w:rPr/>
-      </w:pPr>
-      <w:r>
-        <w:rPr>
-          <w:rtl w:val="0"/>
-        </w:rPr>
-        <w:t xml:space="preserve">Episode 42 - CLARVIA</w:t>
       </w:r>
     </w:p>
     <w:sectPr>

</xml_diff>